<commit_message>
Rewrite lsb guide as step by step walkthrough
</commit_message>
<xml_diff>
--- a/docs/lsb-secret-header-word-guide.docx
+++ b/docs/lsb-secret-header-word-guide.docx
@@ -7,109 +7,80 @@
         <w:pStyle w:val="Title"/>
       </w:pPr>
       <w:r>
-        <w:t>Hướng Dẫn Làm Labtainer</w:t>
+        <w:t>Hướng Dẫn Từng Bước</w:t>
       </w:r>
     </w:p>
     <w:p>
       <w:pPr>
-        <w:pStyle w:val="Subtitle"/>
         <w:jc w:val="left"/>
       </w:pPr>
       <w:r>
-        <w:t>Giấu tin bằng LSB + header bí mật | lsb-secret-header</w:t>
+        <w:rPr>
+          <w:b/>
+        </w:rPr>
+        <w:t>Lab: Giấu tin bằng LSB + header bí mật | lsb-secret-header</w:t>
       </w:r>
     </w:p>
     <w:p>
       <w:r>
-        <w:rPr>
-          <w:b/>
-        </w:rPr>
-        <w:t xml:space="preserve">Dành cho sinh viên. </w:t>
-      </w:r>
-      <w:r>
-        <w:t>Tài liệu này hướng dẫn cách đọc yêu cầu, hoàn thiện chương trình, chạy kiểm tra và nộp kết quả. Không chứa lời giải hoàn chỉnh.</w:t>
-      </w:r>
-    </w:p>
-    <w:p>
-      <w:pPr>
-        <w:pStyle w:val="Heading1"/>
-      </w:pPr>
-      <w:r>
-        <w:t>1. Mục Tiêu Bài Lab</w:t>
-      </w:r>
-    </w:p>
-    <w:p>
-      <w:pPr>
-        <w:pStyle w:val="ListBullet"/>
-      </w:pPr>
-      <w:r>
-        <w:t>Hiểu nguyên lý giấu tin bằng kỹ thuật LSB trong ảnh RGB.</w:t>
-      </w:r>
-    </w:p>
-    <w:p>
-      <w:pPr>
-        <w:pStyle w:val="ListBullet"/>
-      </w:pPr>
-      <w:r>
-        <w:t>Tính dung lượng giấu tin tối đa của ảnh RGB.</w:t>
-      </w:r>
-    </w:p>
-    <w:p>
-      <w:pPr>
-        <w:pStyle w:val="ListBullet"/>
-      </w:pPr>
-      <w:r>
-        <w:t>Tạo packet có MAGIC, LENGTH, SHA-256 và PAYLOAD.</w:t>
-      </w:r>
-    </w:p>
-    <w:p>
-      <w:pPr>
-        <w:pStyle w:val="ListBullet"/>
-      </w:pPr>
-      <w:r>
-        <w:t>Nhúng và trích xuất thông điệp từ ảnh.</w:t>
-      </w:r>
-    </w:p>
-    <w:p>
-      <w:pPr>
-        <w:pStyle w:val="ListBullet"/>
-      </w:pPr>
-      <w:r>
-        <w:t>Kiểm tra tính toàn vẹn bằng SHA-256.</w:t>
-      </w:r>
-    </w:p>
-    <w:p>
-      <w:pPr>
-        <w:pStyle w:val="ListBullet"/>
-      </w:pPr>
-      <w:r>
-        <w:t>Phát hiện ảnh không có header bí mật.</w:t>
-      </w:r>
-    </w:p>
-    <w:p>
-      <w:pPr>
-        <w:pStyle w:val="Heading1"/>
-      </w:pPr>
-      <w:r>
-        <w:t>2. Cài Và Mở Lab</w:t>
+        <w:t>HUONG DAN TUNG BUOC: LAB GIAU TIN BANG LSB + HEADER BI MAT</w:t>
       </w:r>
     </w:p>
     <w:p>
       <w:r>
-        <w:t>Cài lab bằng RAW URL do giảng viên cung cấp:</w:t>
-      </w:r>
-    </w:p>
-    <w:p>
-      <w:pPr>
-        <w:pStyle w:val="Code"/>
-      </w:pPr>
-      <w:r>
-        <w:t>imodule https://github.com/vuxvinh/KiThuatGiauTin/raw/main/lsb-secret-header.tar</w:t>
+        <w:t>Ten bai: lsb-secret-header</w:t>
       </w:r>
     </w:p>
     <w:p>
       <w:r>
-        <w:t>Mở lab:</w:t>
+        <w:t>QUAN TRONG: Khi moi mo lab, se CHUA CO encoded.png va recovered.txt.</w:t>
+      </w:r>
+    </w:p>
+    <w:p>
+      <w:pPr>
+        <w:pStyle w:val="ListBullet"/>
+      </w:pPr>
+      <w:r>
+        <w:t>encoded.png chi duoc tao sau khi ban sua xong encode.py va chay lenh encode.</w:t>
+      </w:r>
+    </w:p>
+    <w:p>
+      <w:pPr>
+        <w:pStyle w:val="ListBullet"/>
+      </w:pPr>
+      <w:r>
+        <w:t>recovered.txt chi duoc tao sau khi ban sua xong decode.py va chay lenh decode.</w:t>
+      </w:r>
+    </w:p>
+    <w:p>
+      <w:pPr>
+        <w:pStyle w:val="ListBullet"/>
+      </w:pPr>
+      <w:r>
+        <w:t>check_work.sh cung se xoa file ket qua cu roi tao lai de cham.</w:t>
+      </w:r>
+    </w:p>
+    <w:p>
+      <w:r>
+        <w:t>RAW URL cai lab:</w:t>
+      </w:r>
+    </w:p>
+    <w:p>
+      <w:r>
+        <w:t>https://github.com/vuxvinh/KiThuatGiauTin/raw/main/lsb-secret-header.tar</w:t>
+      </w:r>
+    </w:p>
+    <w:p>
+      <w:r>
+        <w:t>Chay:</w:t>
+      </w:r>
+    </w:p>
+    <w:p>
+      <w:pPr>
+        <w:pStyle w:val="Code"/>
+      </w:pPr>
+      <w:r>
+        <w:t>imodule https://github.com/vuxvinh/KiThuatGiauTin/raw/main/lsb-secret-header.tar</w:t>
       </w:r>
     </w:p>
     <w:p>
@@ -122,7 +93,7 @@
     </w:p>
     <w:p>
       <w:r>
-        <w:t>Nếu muốn làm lại từ đầu:</w:t>
+        <w:t>Neu muon lam lai tu dau:</w:t>
       </w:r>
     </w:p>
     <w:p>
@@ -135,7 +106,7 @@
     </w:p>
     <w:p>
       <w:r>
-        <w:t>Kiểm tra file trong container:</w:t>
+        <w:t>Kiem tra file ban dau:</w:t>
       </w:r>
     </w:p>
     <w:p>
@@ -147,8 +118,13 @@
       </w:r>
     </w:p>
     <w:p>
-      <w:pPr>
-        <w:pStyle w:val="ListBullet"/>
+      <w:r>
+        <w:t>Ban se thay cac file:</w:t>
+      </w:r>
+    </w:p>
+    <w:p>
+      <w:pPr>
+        <w:pStyle w:val="Code"/>
       </w:pPr>
       <w:r>
         <w:t>README.md</w:t>
@@ -156,7 +132,7 @@
     </w:p>
     <w:p>
       <w:pPr>
-        <w:pStyle w:val="ListBullet"/>
+        <w:pStyle w:val="Code"/>
       </w:pPr>
       <w:r>
         <w:t>cover.png</w:t>
@@ -164,7 +140,7 @@
     </w:p>
     <w:p>
       <w:pPr>
-        <w:pStyle w:val="ListBullet"/>
+        <w:pStyle w:val="Code"/>
       </w:pPr>
       <w:r>
         <w:t>no_secret.png</w:t>
@@ -172,7 +148,7 @@
     </w:p>
     <w:p>
       <w:pPr>
-        <w:pStyle w:val="ListBullet"/>
+        <w:pStyle w:val="Code"/>
       </w:pPr>
       <w:r>
         <w:t>secret.txt</w:t>
@@ -180,7 +156,7 @@
     </w:p>
     <w:p>
       <w:pPr>
-        <w:pStyle w:val="ListBullet"/>
+        <w:pStyle w:val="Code"/>
       </w:pPr>
       <w:r>
         <w:t>encode.py</w:t>
@@ -188,7 +164,7 @@
     </w:p>
     <w:p>
       <w:pPr>
-        <w:pStyle w:val="ListBullet"/>
+        <w:pStyle w:val="Code"/>
       </w:pPr>
       <w:r>
         <w:t>decode.py</w:t>
@@ -196,7 +172,7 @@
     </w:p>
     <w:p>
       <w:pPr>
-        <w:pStyle w:val="ListBullet"/>
+        <w:pStyle w:val="Code"/>
       </w:pPr>
       <w:r>
         <w:t>check_work.sh</w:t>
@@ -204,979 +180,67 @@
     </w:p>
     <w:p>
       <w:pPr>
-        <w:pStyle w:val="ListBullet"/>
+        <w:pStyle w:val="Code"/>
       </w:pPr>
       <w:r>
         <w:t>make_assets.py</w:t>
       </w:r>
     </w:p>
     <w:p>
-      <w:pPr>
-        <w:pStyle w:val="Heading1"/>
-      </w:pPr>
       <w:r>
-        <w:t>3. File Quan Trọng</w:t>
-      </w:r>
-    </w:p>
-    <w:tbl>
-      <w:tblPr>
-        <w:tblStyle w:val="TableGrid"/>
-        <w:tblW w:type="auto" w:w="0"/>
-        <w:jc w:val="left"/>
-        <w:tblLook w:firstColumn="1" w:firstRow="1" w:lastColumn="0" w:lastRow="0" w:noHBand="0" w:noVBand="1" w:val="04A0"/>
-      </w:tblPr>
-      <w:tblGrid>
-        <w:gridCol w:w="4680"/>
-        <w:gridCol w:w="4680"/>
-      </w:tblGrid>
-      <w:tr>
-        <w:tc>
-          <w:tcPr>
-            <w:tcW w:type="dxa" w:w="2200"/>
-            <w:vAlign w:val="center"/>
-            <w:shd w:fill="E8EEF5"/>
-          </w:tcPr>
-          <w:p>
-            <w:pPr>
-              <w:spacing w:after="40"/>
-            </w:pPr>
-            <w:r/>
-            <w:r>
-              <w:rPr>
-                <w:b/>
-              </w:rPr>
-              <w:t>File</w:t>
-            </w:r>
-          </w:p>
-        </w:tc>
-        <w:tc>
-          <w:tcPr>
-            <w:tcW w:type="dxa" w:w="7160"/>
-            <w:vAlign w:val="center"/>
-            <w:shd w:fill="E8EEF5"/>
-          </w:tcPr>
-          <w:p>
-            <w:pPr>
-              <w:spacing w:after="40"/>
-            </w:pPr>
-            <w:r/>
-            <w:r>
-              <w:rPr>
-                <w:b/>
-              </w:rPr>
-              <w:t>Ý nghĩa</w:t>
-            </w:r>
-          </w:p>
-        </w:tc>
-      </w:tr>
-      <w:tr>
-        <w:tc>
-          <w:tcPr>
-            <w:tcW w:type="dxa" w:w="2200"/>
-            <w:vAlign w:val="center"/>
-          </w:tcPr>
-          <w:p>
-            <w:pPr>
-              <w:spacing w:after="40"/>
-            </w:pPr>
-            <w:r/>
-            <w:r>
-              <w:rPr>
-                <w:b/>
-              </w:rPr>
-              <w:t>cover.png</w:t>
-            </w:r>
-          </w:p>
-        </w:tc>
-        <w:tc>
-          <w:tcPr>
-            <w:tcW w:type="dxa" w:w="7160"/>
-            <w:vAlign w:val="center"/>
-          </w:tcPr>
-          <w:p>
-            <w:pPr>
-              <w:spacing w:after="40"/>
-            </w:pPr>
-            <w:r/>
-            <w:r>
-              <w:rPr>
-                <w:b w:val="0"/>
-              </w:rPr>
-              <w:t>Ảnh gốc dùng để giấu thông điệp.</w:t>
-            </w:r>
-          </w:p>
-        </w:tc>
-      </w:tr>
-      <w:tr>
-        <w:tc>
-          <w:tcPr>
-            <w:tcW w:type="dxa" w:w="2200"/>
-            <w:vAlign w:val="center"/>
-          </w:tcPr>
-          <w:p>
-            <w:pPr>
-              <w:spacing w:after="40"/>
-            </w:pPr>
-            <w:r/>
-            <w:r>
-              <w:rPr>
-                <w:b/>
-              </w:rPr>
-              <w:t>no_secret.png</w:t>
-            </w:r>
-          </w:p>
-        </w:tc>
-        <w:tc>
-          <w:tcPr>
-            <w:tcW w:type="dxa" w:w="7160"/>
-            <w:vAlign w:val="center"/>
-          </w:tcPr>
-          <w:p>
-            <w:pPr>
-              <w:spacing w:after="40"/>
-            </w:pPr>
-            <w:r/>
-            <w:r>
-              <w:rPr>
-                <w:b w:val="0"/>
-              </w:rPr>
-              <w:t>Ảnh không có thông điệp, dùng cho negative test.</w:t>
-            </w:r>
-          </w:p>
-        </w:tc>
-      </w:tr>
-      <w:tr>
-        <w:tc>
-          <w:tcPr>
-            <w:tcW w:type="dxa" w:w="2200"/>
-            <w:vAlign w:val="center"/>
-          </w:tcPr>
-          <w:p>
-            <w:pPr>
-              <w:spacing w:after="40"/>
-            </w:pPr>
-            <w:r/>
-            <w:r>
-              <w:rPr>
-                <w:b/>
-              </w:rPr>
-              <w:t>secret.txt</w:t>
-            </w:r>
-          </w:p>
-        </w:tc>
-        <w:tc>
-          <w:tcPr>
-            <w:tcW w:type="dxa" w:w="7160"/>
-            <w:vAlign w:val="center"/>
-          </w:tcPr>
-          <w:p>
-            <w:pPr>
-              <w:spacing w:after="40"/>
-            </w:pPr>
-            <w:r/>
-            <w:r>
-              <w:rPr>
-                <w:b w:val="0"/>
-              </w:rPr>
-              <w:t>Thông điệp bí mật cần giấu.</w:t>
-            </w:r>
-          </w:p>
-        </w:tc>
-      </w:tr>
-      <w:tr>
-        <w:tc>
-          <w:tcPr>
-            <w:tcW w:type="dxa" w:w="2200"/>
-            <w:vAlign w:val="center"/>
-          </w:tcPr>
-          <w:p>
-            <w:pPr>
-              <w:spacing w:after="40"/>
-            </w:pPr>
-            <w:r/>
-            <w:r>
-              <w:rPr>
-                <w:b/>
-              </w:rPr>
-              <w:t>encode.py</w:t>
-            </w:r>
-          </w:p>
-        </w:tc>
-        <w:tc>
-          <w:tcPr>
-            <w:tcW w:type="dxa" w:w="7160"/>
-            <w:vAlign w:val="center"/>
-          </w:tcPr>
-          <w:p>
-            <w:pPr>
-              <w:spacing w:after="40"/>
-            </w:pPr>
-            <w:r/>
-            <w:r>
-              <w:rPr>
-                <w:b w:val="0"/>
-              </w:rPr>
-              <w:t>Chương trình cần hoàn thiện để tạo encoded.png.</w:t>
-            </w:r>
-          </w:p>
-        </w:tc>
-      </w:tr>
-      <w:tr>
-        <w:tc>
-          <w:tcPr>
-            <w:tcW w:type="dxa" w:w="2200"/>
-            <w:vAlign w:val="center"/>
-          </w:tcPr>
-          <w:p>
-            <w:pPr>
-              <w:spacing w:after="40"/>
-            </w:pPr>
-            <w:r/>
-            <w:r>
-              <w:rPr>
-                <w:b/>
-              </w:rPr>
-              <w:t>decode.py</w:t>
-            </w:r>
-          </w:p>
-        </w:tc>
-        <w:tc>
-          <w:tcPr>
-            <w:tcW w:type="dxa" w:w="7160"/>
-            <w:vAlign w:val="center"/>
-          </w:tcPr>
-          <w:p>
-            <w:pPr>
-              <w:spacing w:after="40"/>
-            </w:pPr>
-            <w:r/>
-            <w:r>
-              <w:rPr>
-                <w:b w:val="0"/>
-              </w:rPr>
-              <w:t>Chương trình cần hoàn thiện để tạo recovered.txt.</w:t>
-            </w:r>
-          </w:p>
-        </w:tc>
-      </w:tr>
-      <w:tr>
-        <w:tc>
-          <w:tcPr>
-            <w:tcW w:type="dxa" w:w="2200"/>
-            <w:vAlign w:val="center"/>
-          </w:tcPr>
-          <w:p>
-            <w:pPr>
-              <w:spacing w:after="40"/>
-            </w:pPr>
-            <w:r/>
-            <w:r>
-              <w:rPr>
-                <w:b/>
-              </w:rPr>
-              <w:t>analysis.txt</w:t>
-            </w:r>
-          </w:p>
-        </w:tc>
-        <w:tc>
-          <w:tcPr>
-            <w:tcW w:type="dxa" w:w="7160"/>
-            <w:vAlign w:val="center"/>
-          </w:tcPr>
-          <w:p>
-            <w:pPr>
-              <w:spacing w:after="40"/>
-            </w:pPr>
-            <w:r/>
-            <w:r>
-              <w:rPr>
-                <w:b w:val="0"/>
-              </w:rPr>
-              <w:t>File sinh viên tự tạo để trả lời bài toán dung lượng.</w:t>
-            </w:r>
-          </w:p>
-        </w:tc>
-      </w:tr>
-      <w:tr>
-        <w:tc>
-          <w:tcPr>
-            <w:tcW w:type="dxa" w:w="2200"/>
-            <w:vAlign w:val="center"/>
-          </w:tcPr>
-          <w:p>
-            <w:pPr>
-              <w:spacing w:after="40"/>
-            </w:pPr>
-            <w:r/>
-            <w:r>
-              <w:rPr>
-                <w:b/>
-              </w:rPr>
-              <w:t>check_work.sh</w:t>
-            </w:r>
-          </w:p>
-        </w:tc>
-        <w:tc>
-          <w:tcPr>
-            <w:tcW w:type="dxa" w:w="7160"/>
-            <w:vAlign w:val="center"/>
-          </w:tcPr>
-          <w:p>
-            <w:pPr>
-              <w:spacing w:after="40"/>
-            </w:pPr>
-            <w:r/>
-            <w:r>
-              <w:rPr>
-                <w:b w:val="0"/>
-              </w:rPr>
-              <w:t>Script kiểm tra từng task pass/fail.</w:t>
-            </w:r>
-          </w:p>
-        </w:tc>
-      </w:tr>
-    </w:tbl>
-    <w:p>
-      <w:pPr>
-        <w:pStyle w:val="Heading1"/>
-      </w:pPr>
-      <w:r>
-        <w:t>4. Kiến Thức Nền</w:t>
+        <w:t>Neu khong thay encoded.png hoac recovered.txt luc nay thi DUNG. Hai file do chua duoc tao.</w:t>
       </w:r>
     </w:p>
     <w:p>
       <w:r>
-        <w:t>Ảnh RGB gồm nhiều pixel. Mỗi pixel có 3 kênh màu R, G, B. Mỗi kênh màu là một số từ 0 đến 255, biểu diễn bằng 8 bit.</w:t>
+        <w:t>Chay:</w:t>
+      </w:r>
+    </w:p>
+    <w:p>
+      <w:pPr>
+        <w:pStyle w:val="Code"/>
+      </w:pPr>
+      <w:r>
+        <w:t>bash check_work.sh</w:t>
       </w:r>
     </w:p>
     <w:p>
       <w:r>
-        <w:t>Kỹ thuật LSB, viết tắt của Least Significant Bit, giấu dữ liệu vào bit cuối cùng của mỗi kênh màu.</w:t>
-      </w:r>
-    </w:p>
-    <w:p>
-      <w:pPr>
-        <w:pStyle w:val="Code"/>
-      </w:pPr>
-      <w:r>
-        <w:t>Giá trị ban đầu: 11010110</w:t>
-      </w:r>
-    </w:p>
-    <w:p>
-      <w:pPr>
-        <w:pStyle w:val="Code"/>
-      </w:pPr>
-      <w:r>
-        <w:t>Muốn giấu bit 1: 11010111</w:t>
-      </w:r>
-    </w:p>
-    <w:p>
-      <w:pPr>
-        <w:pStyle w:val="Code"/>
-      </w:pPr>
-      <w:r>
-        <w:t>Muốn giấu bit 0: 11010110</w:t>
-      </w:r>
-    </w:p>
-    <w:p>
-      <w:pPr>
-        <w:pStyle w:val="Heading1"/>
-      </w:pPr>
-      <w:r>
-        <w:t>5. Định Dạng Packet</w:t>
-      </w:r>
-    </w:p>
-    <w:p>
-      <w:pPr>
-        <w:pStyle w:val="Code"/>
-      </w:pPr>
-      <w:r>
-        <w:t>[MAGIC 8 bytes][LENGTH 4 bytes][SHA256 32 bytes][PAYLOAD]</w:t>
-      </w:r>
-    </w:p>
-    <w:p>
-      <w:pPr>
-        <w:pStyle w:val="ListBullet"/>
-      </w:pPr>
-      <w:r>
-        <w:t>MAGIC là header bí mật: PTITLSB1.</w:t>
-      </w:r>
-    </w:p>
-    <w:p>
-      <w:pPr>
-        <w:pStyle w:val="ListBullet"/>
-      </w:pPr>
-      <w:r>
-        <w:t>LENGTH là độ dài PAYLOAD, lưu bằng 4 bytes big-endian.</w:t>
-      </w:r>
-    </w:p>
-    <w:p>
-      <w:pPr>
-        <w:pStyle w:val="ListBullet"/>
-      </w:pPr>
-      <w:r>
-        <w:t>SHA256 là mã băm SHA-256 của PAYLOAD.</w:t>
-      </w:r>
-    </w:p>
-    <w:p>
-      <w:pPr>
-        <w:pStyle w:val="ListBullet"/>
-      </w:pPr>
-      <w:r>
-        <w:t>PAYLOAD là nội dung bí mật đọc từ secret.txt.</w:t>
+        <w:t>Luc chua sua code, ket qua se FAIL. Day la binh thuong.</w:t>
       </w:r>
     </w:p>
     <w:p>
       <w:r>
-        <w:t>Nếu decode ảnh không có header, chương trình phải in:</w:t>
+        <w:t>Ly do:</w:t>
       </w:r>
     </w:p>
     <w:p>
       <w:pPr>
-        <w:pStyle w:val="Code"/>
+        <w:pStyle w:val="ListBullet"/>
       </w:pPr>
       <w:r>
-        <w:t>NO_SECRET_HEADER</w:t>
+        <w:t>encode.py con TODO nen chua tao encoded.png.</w:t>
       </w:r>
     </w:p>
     <w:p>
       <w:pPr>
-        <w:pStyle w:val="Heading1"/>
+        <w:pStyle w:val="ListBullet"/>
       </w:pPr>
       <w:r>
-        <w:t>6. Các Task Cần Pass</w:t>
-      </w:r>
-    </w:p>
-    <w:tbl>
-      <w:tblPr>
-        <w:tblStyle w:val="TableGrid"/>
-        <w:tblW w:type="auto" w:w="0"/>
-        <w:tblLook w:firstColumn="1" w:firstRow="1" w:lastColumn="0" w:lastRow="0" w:noHBand="0" w:noVBand="1" w:val="04A0"/>
-      </w:tblPr>
-      <w:tblGrid>
-        <w:gridCol w:w="3120"/>
-        <w:gridCol w:w="3120"/>
-        <w:gridCol w:w="3120"/>
-      </w:tblGrid>
-      <w:tr>
-        <w:tc>
-          <w:tcPr>
-            <w:tcW w:type="dxa" w:w="900"/>
-            <w:vAlign w:val="center"/>
-            <w:shd w:fill="E8EEF5"/>
-          </w:tcPr>
-          <w:p>
-            <w:pPr>
-              <w:spacing w:after="40"/>
-            </w:pPr>
-            <w:r/>
-            <w:r>
-              <w:rPr>
-                <w:b/>
-              </w:rPr>
-              <w:t>Task</w:t>
-            </w:r>
-          </w:p>
-        </w:tc>
-        <w:tc>
-          <w:tcPr>
-            <w:tcW w:type="dxa" w:w="2500"/>
-            <w:vAlign w:val="center"/>
-            <w:shd w:fill="E8EEF5"/>
-          </w:tcPr>
-          <w:p>
-            <w:pPr>
-              <w:spacing w:after="40"/>
-            </w:pPr>
-            <w:r/>
-            <w:r>
-              <w:rPr>
-                <w:b/>
-              </w:rPr>
-              <w:t>Tên</w:t>
-            </w:r>
-          </w:p>
-        </w:tc>
-        <w:tc>
-          <w:tcPr>
-            <w:tcW w:type="dxa" w:w="5960"/>
-            <w:vAlign w:val="center"/>
-            <w:shd w:fill="E8EEF5"/>
-          </w:tcPr>
-          <w:p>
-            <w:pPr>
-              <w:spacing w:after="40"/>
-            </w:pPr>
-            <w:r/>
-            <w:r>
-              <w:rPr>
-                <w:b/>
-              </w:rPr>
-              <w:t>Điều kiện pass</w:t>
-            </w:r>
-          </w:p>
-        </w:tc>
-      </w:tr>
-      <w:tr>
-        <w:tc>
-          <w:tcPr>
-            <w:tcW w:type="dxa" w:w="900"/>
-            <w:vAlign w:val="center"/>
-          </w:tcPr>
-          <w:p>
-            <w:pPr>
-              <w:spacing w:after="40"/>
-            </w:pPr>
-            <w:r/>
-            <w:r>
-              <w:rPr>
-                <w:b/>
-              </w:rPr>
-              <w:t>1</w:t>
-            </w:r>
-          </w:p>
-        </w:tc>
-        <w:tc>
-          <w:tcPr>
-            <w:tcW w:type="dxa" w:w="2500"/>
-            <w:vAlign w:val="center"/>
-          </w:tcPr>
-          <w:p>
-            <w:pPr>
-              <w:spacing w:after="40"/>
-            </w:pPr>
-            <w:r/>
-            <w:r>
-              <w:rPr>
-                <w:b w:val="0"/>
-              </w:rPr>
-              <w:t>Encode image</w:t>
-            </w:r>
-          </w:p>
-        </w:tc>
-        <w:tc>
-          <w:tcPr>
-            <w:tcW w:type="dxa" w:w="5960"/>
-            <w:vAlign w:val="center"/>
-          </w:tcPr>
-          <w:p>
-            <w:pPr>
-              <w:spacing w:after="40"/>
-            </w:pPr>
-            <w:r/>
-            <w:r>
-              <w:rPr>
-                <w:b w:val="0"/>
-              </w:rPr>
-              <w:t>Tạo được encoded.png và in ENCODE_OK.</w:t>
-            </w:r>
-          </w:p>
-        </w:tc>
-      </w:tr>
-      <w:tr>
-        <w:tc>
-          <w:tcPr>
-            <w:tcW w:type="dxa" w:w="900"/>
-            <w:vAlign w:val="center"/>
-          </w:tcPr>
-          <w:p>
-            <w:pPr>
-              <w:spacing w:after="40"/>
-            </w:pPr>
-            <w:r/>
-            <w:r>
-              <w:rPr>
-                <w:b/>
-              </w:rPr>
-              <w:t>2</w:t>
-            </w:r>
-          </w:p>
-        </w:tc>
-        <w:tc>
-          <w:tcPr>
-            <w:tcW w:type="dxa" w:w="2500"/>
-            <w:vAlign w:val="center"/>
-          </w:tcPr>
-          <w:p>
-            <w:pPr>
-              <w:spacing w:after="40"/>
-            </w:pPr>
-            <w:r/>
-            <w:r>
-              <w:rPr>
-                <w:b w:val="0"/>
-              </w:rPr>
-              <w:t>Detect secret header</w:t>
-            </w:r>
-          </w:p>
-        </w:tc>
-        <w:tc>
-          <w:tcPr>
-            <w:tcW w:type="dxa" w:w="5960"/>
-            <w:vAlign w:val="center"/>
-          </w:tcPr>
-          <w:p>
-            <w:pPr>
-              <w:spacing w:after="40"/>
-            </w:pPr>
-            <w:r/>
-            <w:r>
-              <w:rPr>
-                <w:b w:val="0"/>
-              </w:rPr>
-              <w:t>decode.py phát hiện PTITLSB1 và in HEADER_OK.</w:t>
-            </w:r>
-          </w:p>
-        </w:tc>
-      </w:tr>
-      <w:tr>
-        <w:tc>
-          <w:tcPr>
-            <w:tcW w:type="dxa" w:w="900"/>
-            <w:vAlign w:val="center"/>
-          </w:tcPr>
-          <w:p>
-            <w:pPr>
-              <w:spacing w:after="40"/>
-            </w:pPr>
-            <w:r/>
-            <w:r>
-              <w:rPr>
-                <w:b/>
-              </w:rPr>
-              <w:t>3</w:t>
-            </w:r>
-          </w:p>
-        </w:tc>
-        <w:tc>
-          <w:tcPr>
-            <w:tcW w:type="dxa" w:w="2500"/>
-            <w:vAlign w:val="center"/>
-          </w:tcPr>
-          <w:p>
-            <w:pPr>
-              <w:spacing w:after="40"/>
-            </w:pPr>
-            <w:r/>
-            <w:r>
-              <w:rPr>
-                <w:b w:val="0"/>
-              </w:rPr>
-              <w:t>Verify SHA-256</w:t>
-            </w:r>
-          </w:p>
-        </w:tc>
-        <w:tc>
-          <w:tcPr>
-            <w:tcW w:type="dxa" w:w="5960"/>
-            <w:vAlign w:val="center"/>
-          </w:tcPr>
-          <w:p>
-            <w:pPr>
-              <w:spacing w:after="40"/>
-            </w:pPr>
-            <w:r/>
-            <w:r>
-              <w:rPr>
-                <w:b w:val="0"/>
-              </w:rPr>
-              <w:t>Hash của payload đúng và in SHA256_OK.</w:t>
-            </w:r>
-          </w:p>
-        </w:tc>
-      </w:tr>
-      <w:tr>
-        <w:tc>
-          <w:tcPr>
-            <w:tcW w:type="dxa" w:w="900"/>
-            <w:vAlign w:val="center"/>
-          </w:tcPr>
-          <w:p>
-            <w:pPr>
-              <w:spacing w:after="40"/>
-            </w:pPr>
-            <w:r/>
-            <w:r>
-              <w:rPr>
-                <w:b/>
-              </w:rPr>
-              <w:t>4</w:t>
-            </w:r>
-          </w:p>
-        </w:tc>
-        <w:tc>
-          <w:tcPr>
-            <w:tcW w:type="dxa" w:w="2500"/>
-            <w:vAlign w:val="center"/>
-          </w:tcPr>
-          <w:p>
-            <w:pPr>
-              <w:spacing w:after="40"/>
-            </w:pPr>
-            <w:r/>
-            <w:r>
-              <w:rPr>
-                <w:b w:val="0"/>
-              </w:rPr>
-              <w:t>Recover original message</w:t>
-            </w:r>
-          </w:p>
-        </w:tc>
-        <w:tc>
-          <w:tcPr>
-            <w:tcW w:type="dxa" w:w="5960"/>
-            <w:vAlign w:val="center"/>
-          </w:tcPr>
-          <w:p>
-            <w:pPr>
-              <w:spacing w:after="40"/>
-            </w:pPr>
-            <w:r/>
-            <w:r>
-              <w:rPr>
-                <w:b w:val="0"/>
-              </w:rPr>
-              <w:t>recovered.txt giống secret.txt.</w:t>
-            </w:r>
-          </w:p>
-        </w:tc>
-      </w:tr>
-      <w:tr>
-        <w:tc>
-          <w:tcPr>
-            <w:tcW w:type="dxa" w:w="900"/>
-            <w:vAlign w:val="center"/>
-          </w:tcPr>
-          <w:p>
-            <w:pPr>
-              <w:spacing w:after="40"/>
-            </w:pPr>
-            <w:r/>
-            <w:r>
-              <w:rPr>
-                <w:b/>
-              </w:rPr>
-              <w:t>5</w:t>
-            </w:r>
-          </w:p>
-        </w:tc>
-        <w:tc>
-          <w:tcPr>
-            <w:tcW w:type="dxa" w:w="2500"/>
-            <w:vAlign w:val="center"/>
-          </w:tcPr>
-          <w:p>
-            <w:pPr>
-              <w:spacing w:after="40"/>
-            </w:pPr>
-            <w:r/>
-            <w:r>
-              <w:rPr>
-                <w:b w:val="0"/>
-              </w:rPr>
-              <w:t>Detect image without secret</w:t>
-            </w:r>
-          </w:p>
-        </w:tc>
-        <w:tc>
-          <w:tcPr>
-            <w:tcW w:type="dxa" w:w="5960"/>
-            <w:vAlign w:val="center"/>
-          </w:tcPr>
-          <w:p>
-            <w:pPr>
-              <w:spacing w:after="40"/>
-            </w:pPr>
-            <w:r/>
-            <w:r>
-              <w:rPr>
-                <w:b w:val="0"/>
-              </w:rPr>
-              <w:t>no_secret.png cho kết quả NO_SECRET_HEADER.</w:t>
-            </w:r>
-          </w:p>
-        </w:tc>
-      </w:tr>
-      <w:tr>
-        <w:tc>
-          <w:tcPr>
-            <w:tcW w:type="dxa" w:w="900"/>
-            <w:vAlign w:val="center"/>
-          </w:tcPr>
-          <w:p>
-            <w:pPr>
-              <w:spacing w:after="40"/>
-            </w:pPr>
-            <w:r/>
-            <w:r>
-              <w:rPr>
-                <w:b/>
-              </w:rPr>
-              <w:t>6</w:t>
-            </w:r>
-          </w:p>
-        </w:tc>
-        <w:tc>
-          <w:tcPr>
-            <w:tcW w:type="dxa" w:w="2500"/>
-            <w:vAlign w:val="center"/>
-          </w:tcPr>
-          <w:p>
-            <w:pPr>
-              <w:spacing w:after="40"/>
-            </w:pPr>
-            <w:r/>
-            <w:r>
-              <w:rPr>
-                <w:b w:val="0"/>
-              </w:rPr>
-              <w:t>Calculate capacity</w:t>
-            </w:r>
-          </w:p>
-        </w:tc>
-        <w:tc>
-          <w:tcPr>
-            <w:tcW w:type="dxa" w:w="5960"/>
-            <w:vAlign w:val="center"/>
-          </w:tcPr>
-          <w:p>
-            <w:pPr>
-              <w:spacing w:after="40"/>
-            </w:pPr>
-            <w:r/>
-            <w:r>
-              <w:rPr>
-                <w:b w:val="0"/>
-              </w:rPr>
-              <w:t>analysis.txt có đúng 4 dòng dung lượng.</w:t>
-            </w:r>
-          </w:p>
-        </w:tc>
-      </w:tr>
-    </w:tbl>
-    <w:p>
-      <w:pPr>
-        <w:pStyle w:val="Heading1"/>
-      </w:pPr>
-      <w:r>
-        <w:t>7. Hướng Dẫn Làm encode.py</w:t>
+        <w:t>decode.py con TODO nen chua tao recovered.txt.</w:t>
       </w:r>
     </w:p>
     <w:p>
       <w:pPr>
-        <w:pStyle w:val="Heading2"/>
+        <w:pStyle w:val="ListBullet"/>
       </w:pPr>
       <w:r>
-        <w:t>build_packet(payload)</w:t>
-      </w:r>
-    </w:p>
-    <w:p>
-      <w:pPr>
-        <w:pStyle w:val="ListBullet"/>
-      </w:pPr>
-      <w:r>
-        <w:t>Dùng struct.pack("&gt;I", len(payload)) để tạo LENGTH 4 bytes big-endian.</w:t>
-      </w:r>
-    </w:p>
-    <w:p>
-      <w:pPr>
-        <w:pStyle w:val="ListBullet"/>
-      </w:pPr>
-      <w:r>
-        <w:t>Dùng hashlib.sha256(payload).digest() để tạo SHA256 32 bytes.</w:t>
-      </w:r>
-    </w:p>
-    <w:p>
-      <w:pPr>
-        <w:pStyle w:val="ListBullet"/>
-      </w:pPr>
-      <w:r>
-        <w:t>Trả về MAGIC + LENGTH + SHA256 + payload.</w:t>
-      </w:r>
-    </w:p>
-    <w:p>
-      <w:pPr>
-        <w:pStyle w:val="Heading2"/>
-      </w:pPr>
-      <w:r>
-        <w:t>capacity_bits(img)</w:t>
-      </w:r>
-    </w:p>
-    <w:p>
-      <w:pPr>
-        <w:pStyle w:val="ListBullet"/>
-      </w:pPr>
-      <w:r>
-        <w:t>Ảnh RGB có width * height pixel.</w:t>
-      </w:r>
-    </w:p>
-    <w:p>
-      <w:pPr>
-        <w:pStyle w:val="ListBullet"/>
-      </w:pPr>
-      <w:r>
-        <w:t>Mỗi pixel có 3 kênh màu.</w:t>
-      </w:r>
-    </w:p>
-    <w:p>
-      <w:pPr>
-        <w:pStyle w:val="ListBullet"/>
-      </w:pPr>
-      <w:r>
-        <w:t>Mỗi kênh giấu được 1 bit.</w:t>
-      </w:r>
-    </w:p>
-    <w:p>
-      <w:pPr>
-        <w:pStyle w:val="ListBullet"/>
-      </w:pPr>
-      <w:r>
-        <w:t>Công thức: width * height * 3.</w:t>
-      </w:r>
-    </w:p>
-    <w:p>
-      <w:pPr>
-        <w:pStyle w:val="Heading2"/>
-      </w:pPr>
-      <w:r>
-        <w:t>embed_packet(img, packet)</w:t>
-      </w:r>
-    </w:p>
-    <w:p>
-      <w:pPr>
-        <w:pStyle w:val="ListBullet"/>
-      </w:pPr>
-      <w:r>
-        <w:t>Chuyển packet thành dãy bit theo thứ tự bit cao đến bit thấp.</w:t>
-      </w:r>
-    </w:p>
-    <w:p>
-      <w:pPr>
-        <w:pStyle w:val="ListBullet"/>
-      </w:pPr>
-      <w:r>
-        <w:t>Duyệt pixel từ trái sang phải, từ trên xuống dưới.</w:t>
-      </w:r>
-    </w:p>
-    <w:p>
-      <w:pPr>
-        <w:pStyle w:val="ListBullet"/>
-      </w:pPr>
-      <w:r>
-        <w:t>Với mỗi bit, thay LSB của từng kênh R, G, B.</w:t>
-      </w:r>
-    </w:p>
-    <w:p>
-      <w:pPr>
-        <w:pStyle w:val="ListBullet"/>
-      </w:pPr>
-      <w:r>
-        <w:t>Tạo ảnh mới và lưu ra encoded.png.</w:t>
+        <w:t>analysis.txt chua duoc tao.</w:t>
       </w:r>
     </w:p>
     <w:p>
       <w:r>
-        <w:t>Công thức thay LSB:</w:t>
+        <w:t>Mo file:</w:t>
       </w:r>
     </w:p>
     <w:p>
@@ -1184,180 +248,198 @@
         <w:pStyle w:val="Code"/>
       </w:pPr>
       <w:r>
-        <w:t>new_value = (old_value &amp; 0xFE) | bit</w:t>
-      </w:r>
-    </w:p>
-    <w:p>
-      <w:pPr>
-        <w:pStyle w:val="Heading1"/>
-      </w:pPr>
-      <w:r>
-        <w:t>8. Hướng Dẫn Làm decode.py</w:t>
-      </w:r>
-    </w:p>
-    <w:p>
-      <w:pPr>
-        <w:pStyle w:val="Heading2"/>
-      </w:pPr>
-      <w:r>
-        <w:t>image_lsb_bits(img)</w:t>
-      </w:r>
-    </w:p>
-    <w:p>
-      <w:pPr>
-        <w:pStyle w:val="ListBullet"/>
-      </w:pPr>
-      <w:r>
-        <w:t>Chuyển ảnh sang RGB.</w:t>
-      </w:r>
-    </w:p>
-    <w:p>
-      <w:pPr>
-        <w:pStyle w:val="ListBullet"/>
-      </w:pPr>
-      <w:r>
-        <w:t>Duyệt từng pixel theo thứ tự getdata().</w:t>
-      </w:r>
-    </w:p>
-    <w:p>
-      <w:pPr>
-        <w:pStyle w:val="ListBullet"/>
-      </w:pPr>
-      <w:r>
-        <w:t>Với mỗi pixel, yield r &amp; 1, g &amp; 1, b &amp; 1.</w:t>
-      </w:r>
-    </w:p>
-    <w:p>
-      <w:pPr>
-        <w:pStyle w:val="Heading2"/>
-      </w:pPr>
-      <w:r>
-        <w:t>bits_to_bytes(bits)</w:t>
-      </w:r>
-    </w:p>
-    <w:p>
-      <w:pPr>
-        <w:pStyle w:val="ListBullet"/>
-      </w:pPr>
-      <w:r>
-        <w:t>Gom mỗi 8 bit thành 1 byte.</w:t>
-      </w:r>
-    </w:p>
-    <w:p>
-      <w:pPr>
-        <w:pStyle w:val="ListBullet"/>
-      </w:pPr>
-      <w:r>
-        <w:t>Bit đầu tiên là bit có trọng số cao nhất.</w:t>
-      </w:r>
-    </w:p>
-    <w:p>
-      <w:pPr>
-        <w:pStyle w:val="ListBullet"/>
-      </w:pPr>
-      <w:r>
-        <w:t>Tạo byte bằng cách dịch trái và OR với bit hiện tại.</w:t>
-      </w:r>
-    </w:p>
-    <w:p>
-      <w:pPr>
-        <w:pStyle w:val="Heading2"/>
-      </w:pPr>
-      <w:r>
-        <w:t>read_bytes_from_lsb(img, nbytes)</w:t>
-      </w:r>
-    </w:p>
-    <w:p>
-      <w:pPr>
-        <w:pStyle w:val="ListBullet"/>
-      </w:pPr>
-      <w:r>
-        <w:t>Đọc nbytes * 8 bit từ LSB của ảnh.</w:t>
-      </w:r>
-    </w:p>
-    <w:p>
-      <w:pPr>
-        <w:pStyle w:val="ListBullet"/>
-      </w:pPr>
-      <w:r>
-        <w:t>Chuyển các bit đã đọc thành bytes.</w:t>
-      </w:r>
-    </w:p>
-    <w:p>
-      <w:pPr>
-        <w:pStyle w:val="Heading2"/>
-      </w:pPr>
-      <w:r>
-        <w:t>Quy trình decode</w:t>
-      </w:r>
-    </w:p>
-    <w:p>
-      <w:pPr>
-        <w:pStyle w:val="ListNumber"/>
-      </w:pPr>
-      <w:r>
-        <w:t>Đọc 44 bytes header đầu tiên.</w:t>
-      </w:r>
-    </w:p>
-    <w:p>
-      <w:pPr>
-        <w:pStyle w:val="ListNumber"/>
-      </w:pPr>
-      <w:r>
-        <w:t>Kiểm tra 8 bytes đầu có bằng PTITLSB1 không.</w:t>
-      </w:r>
-    </w:p>
-    <w:p>
-      <w:pPr>
-        <w:pStyle w:val="ListNumber"/>
-      </w:pPr>
-      <w:r>
-        <w:t>Nếu không đúng, in NO_SECRET_HEADER.</w:t>
-      </w:r>
-    </w:p>
-    <w:p>
-      <w:pPr>
-        <w:pStyle w:val="ListNumber"/>
-      </w:pPr>
-      <w:r>
-        <w:t>Nếu đúng, đọc LENGTH và SHA256.</w:t>
-      </w:r>
-    </w:p>
-    <w:p>
-      <w:pPr>
-        <w:pStyle w:val="ListNumber"/>
-      </w:pPr>
-      <w:r>
-        <w:t>Đọc tiếp PAYLOAD theo LENGTH.</w:t>
-      </w:r>
-    </w:p>
-    <w:p>
-      <w:pPr>
-        <w:pStyle w:val="ListNumber"/>
-      </w:pPr>
-      <w:r>
-        <w:t>Tính SHA-256 của PAYLOAD và so sánh.</w:t>
-      </w:r>
-    </w:p>
-    <w:p>
-      <w:pPr>
-        <w:pStyle w:val="ListNumber"/>
-      </w:pPr>
-      <w:r>
-        <w:t>Nếu đúng, ghi PAYLOAD ra recovered.txt.</w:t>
-      </w:r>
-    </w:p>
-    <w:p>
-      <w:pPr>
-        <w:pStyle w:val="Heading1"/>
-      </w:pPr>
-      <w:r>
-        <w:t>9. Chạy Thử Từng Bước</w:t>
+        <w:t>nano encode.py</w:t>
       </w:r>
     </w:p>
     <w:p>
       <w:r>
-        <w:t>Chạy encode:</w:t>
+        <w:t>Trong encode.py, tim ham build_packet(payload) va thay toan bo phan than ham bang:</w:t>
+      </w:r>
+    </w:p>
+    <w:p>
+      <w:pPr>
+        <w:pStyle w:val="Code"/>
+      </w:pPr>
+      <w:r>
+        <w:t>def build_packet(payload: bytes) -&gt; bytes:</w:t>
+      </w:r>
+    </w:p>
+    <w:p>
+      <w:pPr>
+        <w:pStyle w:val="Code"/>
+      </w:pPr>
+      <w:r>
+        <w:t xml:space="preserve">    length_bytes = struct.pack("&gt;I", len(payload))</w:t>
+      </w:r>
+    </w:p>
+    <w:p>
+      <w:pPr>
+        <w:pStyle w:val="Code"/>
+      </w:pPr>
+      <w:r>
+        <w:t xml:space="preserve">    digest = hashlib.sha256(payload).digest()</w:t>
+      </w:r>
+    </w:p>
+    <w:p>
+      <w:pPr>
+        <w:pStyle w:val="Code"/>
+      </w:pPr>
+      <w:r>
+        <w:t xml:space="preserve">    return MAGIC + length_bytes + digest + payload</w:t>
+      </w:r>
+    </w:p>
+    <w:p>
+      <w:r>
+        <w:t>Tim ham capacity_bits(img) va thay bang:</w:t>
+      </w:r>
+    </w:p>
+    <w:p>
+      <w:pPr>
+        <w:pStyle w:val="Code"/>
+      </w:pPr>
+      <w:r>
+        <w:t>def capacity_bits(img: Image.Image) -&gt; int:</w:t>
+      </w:r>
+    </w:p>
+    <w:p>
+      <w:pPr>
+        <w:pStyle w:val="Code"/>
+      </w:pPr>
+      <w:r>
+        <w:t xml:space="preserve">    return img.width * img.height * 3</w:t>
+      </w:r>
+    </w:p>
+    <w:p>
+      <w:r>
+        <w:t>Tim ham embed_packet(img, packet) va thay bang:</w:t>
+      </w:r>
+    </w:p>
+    <w:p>
+      <w:pPr>
+        <w:pStyle w:val="Code"/>
+      </w:pPr>
+      <w:r>
+        <w:t>def embed_packet(img: Image.Image, packet: bytes) -&gt; Image.Image:</w:t>
+      </w:r>
+    </w:p>
+    <w:p>
+      <w:pPr>
+        <w:pStyle w:val="Code"/>
+      </w:pPr>
+      <w:r>
+        <w:t xml:space="preserve">    img = img.convert("RGB")</w:t>
+      </w:r>
+    </w:p>
+    <w:p>
+      <w:pPr>
+        <w:pStyle w:val="Code"/>
+      </w:pPr>
+      <w:r>
+        <w:t xml:space="preserve">    pixels = list(img.getdata())</w:t>
+      </w:r>
+    </w:p>
+    <w:p>
+      <w:r>
+        <w:t xml:space="preserve">    channels = []</w:t>
+      </w:r>
+    </w:p>
+    <w:p>
+      <w:r>
+        <w:t xml:space="preserve">    for r, g, b in pixels:</w:t>
+      </w:r>
+    </w:p>
+    <w:p>
+      <w:r>
+        <w:t xml:space="preserve">        channels.extend([r, g, b])</w:t>
+      </w:r>
+    </w:p>
+    <w:p>
+      <w:r>
+        <w:t xml:space="preserve">    bits = list(bytes_to_bits(packet))</w:t>
+      </w:r>
+    </w:p>
+    <w:p>
+      <w:r>
+        <w:t xml:space="preserve">    if len(bits) &gt; len(channels):</w:t>
+      </w:r>
+    </w:p>
+    <w:p>
+      <w:r>
+        <w:t xml:space="preserve">        raise ValueError("Packet is too large for this image")</w:t>
+      </w:r>
+    </w:p>
+    <w:p>
+      <w:r>
+        <w:t xml:space="preserve">    for i, bit in enumerate(bits):</w:t>
+      </w:r>
+    </w:p>
+    <w:p>
+      <w:r>
+        <w:t xml:space="preserve">        channels[i] = (channels[i] &amp; 0xFE) | bit</w:t>
+      </w:r>
+    </w:p>
+    <w:p>
+      <w:r>
+        <w:t xml:space="preserve">    new_pixels = []</w:t>
+      </w:r>
+    </w:p>
+    <w:p>
+      <w:r>
+        <w:t xml:space="preserve">    for i in range(0, len(channels), 3):</w:t>
+      </w:r>
+    </w:p>
+    <w:p>
+      <w:r>
+        <w:t xml:space="preserve">        new_pixels.append((channels[i], channels[i + 1], channels[i + 2]))</w:t>
+      </w:r>
+    </w:p>
+    <w:p>
+      <w:r>
+        <w:t xml:space="preserve">    out = Image.new("RGB", img.size)</w:t>
+      </w:r>
+    </w:p>
+    <w:p>
+      <w:r>
+        <w:t xml:space="preserve">    out.putdata(new_pixels)</w:t>
+      </w:r>
+    </w:p>
+    <w:p>
+      <w:r>
+        <w:t xml:space="preserve">    return out</w:t>
+      </w:r>
+    </w:p>
+    <w:p>
+      <w:r>
+        <w:t>Luu file trong nano:</w:t>
+      </w:r>
+    </w:p>
+    <w:p>
+      <w:pPr>
+        <w:pStyle w:val="ListBullet"/>
+      </w:pPr>
+      <w:r>
+        <w:t>Nhan Ctrl+O</w:t>
+      </w:r>
+    </w:p>
+    <w:p>
+      <w:pPr>
+        <w:pStyle w:val="ListBullet"/>
+      </w:pPr>
+      <w:r>
+        <w:t>Nhan Enter</w:t>
+      </w:r>
+    </w:p>
+    <w:p>
+      <w:pPr>
+        <w:pStyle w:val="ListBullet"/>
+      </w:pPr>
+      <w:r>
+        <w:t>Nhan Ctrl+X</w:t>
+      </w:r>
+    </w:p>
+    <w:p>
+      <w:r>
+        <w:t>Kiem tra encode.py:</w:t>
       </w:r>
     </w:p>
     <w:p>
@@ -1370,7 +452,250 @@
     </w:p>
     <w:p>
       <w:r>
-        <w:t>Chạy decode:</w:t>
+        <w:t>Neu dung, se thay ENCODE_OK va luc nay moi co file encoded.png.</w:t>
+      </w:r>
+    </w:p>
+    <w:p>
+      <w:r>
+        <w:t>Kiem tra:</w:t>
+      </w:r>
+    </w:p>
+    <w:p>
+      <w:pPr>
+        <w:pStyle w:val="Code"/>
+      </w:pPr>
+      <w:r>
+        <w:t>ls -l encoded.png</w:t>
+      </w:r>
+    </w:p>
+    <w:p>
+      <w:r>
+        <w:t>Mo file:</w:t>
+      </w:r>
+    </w:p>
+    <w:p>
+      <w:pPr>
+        <w:pStyle w:val="Code"/>
+      </w:pPr>
+      <w:r>
+        <w:t>nano decode.py</w:t>
+      </w:r>
+    </w:p>
+    <w:p>
+      <w:r>
+        <w:t>Tim ham image_lsb_bits(img) va thay bang:</w:t>
+      </w:r>
+    </w:p>
+    <w:p>
+      <w:pPr>
+        <w:pStyle w:val="Code"/>
+      </w:pPr>
+      <w:r>
+        <w:t>def image_lsb_bits(img: Image.Image):</w:t>
+      </w:r>
+    </w:p>
+    <w:p>
+      <w:pPr>
+        <w:pStyle w:val="Code"/>
+      </w:pPr>
+      <w:r>
+        <w:t xml:space="preserve">    img = img.convert("RGB")</w:t>
+      </w:r>
+    </w:p>
+    <w:p>
+      <w:pPr>
+        <w:pStyle w:val="Code"/>
+      </w:pPr>
+      <w:r>
+        <w:t xml:space="preserve">    for r, g, b in img.getdata():</w:t>
+      </w:r>
+    </w:p>
+    <w:p>
+      <w:pPr>
+        <w:pStyle w:val="Code"/>
+      </w:pPr>
+      <w:r>
+        <w:t xml:space="preserve">        yield r &amp; 1</w:t>
+      </w:r>
+    </w:p>
+    <w:p>
+      <w:pPr>
+        <w:pStyle w:val="Code"/>
+      </w:pPr>
+      <w:r>
+        <w:t xml:space="preserve">        yield g &amp; 1</w:t>
+      </w:r>
+    </w:p>
+    <w:p>
+      <w:pPr>
+        <w:pStyle w:val="Code"/>
+      </w:pPr>
+      <w:r>
+        <w:t xml:space="preserve">        yield b &amp; 1</w:t>
+      </w:r>
+    </w:p>
+    <w:p>
+      <w:r>
+        <w:t>Tim ham bits_to_bytes(bits) va thay bang:</w:t>
+      </w:r>
+    </w:p>
+    <w:p>
+      <w:pPr>
+        <w:pStyle w:val="Code"/>
+      </w:pPr>
+      <w:r>
+        <w:t>def bits_to_bytes(bits):</w:t>
+      </w:r>
+    </w:p>
+    <w:p>
+      <w:pPr>
+        <w:pStyle w:val="Code"/>
+      </w:pPr>
+      <w:r>
+        <w:t xml:space="preserve">    data = bytearray()</w:t>
+      </w:r>
+    </w:p>
+    <w:p>
+      <w:r>
+        <w:t xml:space="preserve">    for i in range(0, len(bits), 8):</w:t>
+      </w:r>
+    </w:p>
+    <w:p>
+      <w:r>
+        <w:t xml:space="preserve">        chunk = bits[i:i + 8]</w:t>
+      </w:r>
+    </w:p>
+    <w:p>
+      <w:r>
+        <w:t xml:space="preserve">        if len(chunk) &lt; 8:</w:t>
+      </w:r>
+    </w:p>
+    <w:p>
+      <w:r>
+        <w:t xml:space="preserve">            break</w:t>
+      </w:r>
+    </w:p>
+    <w:p>
+      <w:r>
+        <w:t xml:space="preserve">        value = 0</w:t>
+      </w:r>
+    </w:p>
+    <w:p>
+      <w:r>
+        <w:t xml:space="preserve">        for bit in chunk:</w:t>
+      </w:r>
+    </w:p>
+    <w:p>
+      <w:r>
+        <w:t xml:space="preserve">            value = (value &lt;&lt; 1) | bit</w:t>
+      </w:r>
+    </w:p>
+    <w:p>
+      <w:r>
+        <w:t xml:space="preserve">        data.append(value)</w:t>
+      </w:r>
+    </w:p>
+    <w:p>
+      <w:r>
+        <w:t xml:space="preserve">    return bytes(data)</w:t>
+      </w:r>
+    </w:p>
+    <w:p>
+      <w:r>
+        <w:t>Tim ham read_bytes_from_lsb(img, nbytes) va thay bang:</w:t>
+      </w:r>
+    </w:p>
+    <w:p>
+      <w:pPr>
+        <w:pStyle w:val="Code"/>
+      </w:pPr>
+      <w:r>
+        <w:t>def read_bytes_from_lsb(img: Image.Image, nbytes: int) -&gt; bytes:</w:t>
+      </w:r>
+    </w:p>
+    <w:p>
+      <w:pPr>
+        <w:pStyle w:val="Code"/>
+      </w:pPr>
+      <w:r>
+        <w:t xml:space="preserve">    need_bits = nbytes * 8</w:t>
+      </w:r>
+    </w:p>
+    <w:p>
+      <w:pPr>
+        <w:pStyle w:val="Code"/>
+      </w:pPr>
+      <w:r>
+        <w:t xml:space="preserve">    bits = []</w:t>
+      </w:r>
+    </w:p>
+    <w:p>
+      <w:r>
+        <w:t xml:space="preserve">    for bit in image_lsb_bits(img):</w:t>
+      </w:r>
+    </w:p>
+    <w:p>
+      <w:r>
+        <w:t xml:space="preserve">        bits.append(bit)</w:t>
+      </w:r>
+    </w:p>
+    <w:p>
+      <w:r>
+        <w:t xml:space="preserve">        if len(bits) == need_bits:</w:t>
+      </w:r>
+    </w:p>
+    <w:p>
+      <w:r>
+        <w:t xml:space="preserve">            break</w:t>
+      </w:r>
+    </w:p>
+    <w:p>
+      <w:r>
+        <w:t xml:space="preserve">    if len(bits) &lt; need_bits:</w:t>
+      </w:r>
+    </w:p>
+    <w:p>
+      <w:r>
+        <w:t xml:space="preserve">        raise ValueError("Image does not contain enough LSB bits")</w:t>
+      </w:r>
+    </w:p>
+    <w:p>
+      <w:r>
+        <w:t xml:space="preserve">    return bits_to_bytes(bits)</w:t>
+      </w:r>
+    </w:p>
+    <w:p>
+      <w:r>
+        <w:t>Luu file trong nano:</w:t>
+      </w:r>
+    </w:p>
+    <w:p>
+      <w:pPr>
+        <w:pStyle w:val="ListBullet"/>
+      </w:pPr>
+      <w:r>
+        <w:t>Nhan Ctrl+O</w:t>
+      </w:r>
+    </w:p>
+    <w:p>
+      <w:pPr>
+        <w:pStyle w:val="ListBullet"/>
+      </w:pPr>
+      <w:r>
+        <w:t>Nhan Enter</w:t>
+      </w:r>
+    </w:p>
+    <w:p>
+      <w:pPr>
+        <w:pStyle w:val="ListBullet"/>
+      </w:pPr>
+      <w:r>
+        <w:t>Nhan Ctrl+X</w:t>
+      </w:r>
+    </w:p>
+    <w:p>
+      <w:r>
+        <w:t>Kiem tra decode.py:</w:t>
       </w:r>
     </w:p>
     <w:p>
@@ -1383,7 +708,62 @@
     </w:p>
     <w:p>
       <w:r>
-        <w:t>So sánh thông điệp:</w:t>
+        <w:t>Neu dung, se thay:</w:t>
+      </w:r>
+    </w:p>
+    <w:p>
+      <w:pPr>
+        <w:pStyle w:val="Code"/>
+      </w:pPr>
+      <w:r>
+        <w:t>HEADER_OK</w:t>
+      </w:r>
+    </w:p>
+    <w:p>
+      <w:pPr>
+        <w:pStyle w:val="Code"/>
+      </w:pPr>
+      <w:r>
+        <w:t>SHA256_OK</w:t>
+      </w:r>
+    </w:p>
+    <w:p>
+      <w:pPr>
+        <w:pStyle w:val="Code"/>
+      </w:pPr>
+      <w:r>
+        <w:t>DECODE_OK</w:t>
+      </w:r>
+    </w:p>
+    <w:p>
+      <w:r>
+        <w:t>Luc nay moi co file recovered.txt.</w:t>
+      </w:r>
+    </w:p>
+    <w:p>
+      <w:r>
+        <w:t>Kiem tra:</w:t>
+      </w:r>
+    </w:p>
+    <w:p>
+      <w:pPr>
+        <w:pStyle w:val="Code"/>
+      </w:pPr>
+      <w:r>
+        <w:t>ls -l recovered.txt</w:t>
+      </w:r>
+    </w:p>
+    <w:p>
+      <w:pPr>
+        <w:pStyle w:val="Code"/>
+      </w:pPr>
+      <w:r>
+        <w:t>cat recovered.txt</w:t>
+      </w:r>
+    </w:p>
+    <w:p>
+      <w:r>
+        <w:t>So sanh voi secret.txt:</w:t>
       </w:r>
     </w:p>
     <w:p>
@@ -1404,7 +784,12 @@
     </w:p>
     <w:p>
       <w:r>
-        <w:t>Chạy negative test:</w:t>
+        <w:t>Neu echo $? in ra 0 thi hai file giong nhau.</w:t>
+      </w:r>
+    </w:p>
+    <w:p>
+      <w:r>
+        <w:t>Chay:</w:t>
       </w:r>
     </w:p>
     <w:p>
@@ -1416,53 +801,60 @@
       </w:r>
     </w:p>
     <w:p>
-      <w:pPr>
-        <w:pStyle w:val="Heading1"/>
-      </w:pPr>
       <w:r>
-        <w:t>10. Tạo analysis.txt</w:t>
+        <w:t>Ket qua dung:</w:t>
       </w:r>
     </w:p>
     <w:p>
       <w:r>
-        <w:t>Với ảnh cover.png kích thước 256x256 RGB:</w:t>
-      </w:r>
-    </w:p>
-    <w:p>
-      <w:pPr>
-        <w:pStyle w:val="Code"/>
-      </w:pPr>
-      <w:r>
-        <w:t>capacity_bits = 256 * 256 * 3 = 196608</w:t>
-      </w:r>
-    </w:p>
-    <w:p>
-      <w:pPr>
-        <w:pStyle w:val="Code"/>
-      </w:pPr>
-      <w:r>
-        <w:t>capacity_bytes = 196608 / 8 = 24576</w:t>
-      </w:r>
-    </w:p>
-    <w:p>
-      <w:pPr>
-        <w:pStyle w:val="Code"/>
-      </w:pPr>
-      <w:r>
-        <w:t>header_bytes = 8 + 4 + 32 = 44</w:t>
-      </w:r>
-    </w:p>
-    <w:p>
-      <w:pPr>
-        <w:pStyle w:val="Code"/>
-      </w:pPr>
-      <w:r>
-        <w:t>max_payload_bytes = 24576 - 44 = 24532</w:t>
+        <w:t>NO_SECRET_HEADER</w:t>
       </w:r>
     </w:p>
     <w:p>
       <w:r>
-        <w:t>Nội dung file analysis.txt cần có:</w:t>
+        <w:t>Ghi chu:</w:t>
+      </w:r>
+    </w:p>
+    <w:p>
+      <w:pPr>
+        <w:pStyle w:val="ListBullet"/>
+      </w:pPr>
+      <w:r>
+        <w:t>Lenh nay co the thoat voi ma loi 3.</w:t>
+      </w:r>
+    </w:p>
+    <w:p>
+      <w:pPr>
+        <w:pStyle w:val="ListBullet"/>
+      </w:pPr>
+      <w:r>
+        <w:t>Dieu quan trong la output co NO_SECRET_HEADER.</w:t>
+      </w:r>
+    </w:p>
+    <w:p>
+      <w:pPr>
+        <w:pStyle w:val="ListBullet"/>
+      </w:pPr>
+      <w:r>
+        <w:t>Khong can tao recovered_empty.txt.</w:t>
+      </w:r>
+    </w:p>
+    <w:p>
+      <w:r>
+        <w:t>Tao file:</w:t>
+      </w:r>
+    </w:p>
+    <w:p>
+      <w:pPr>
+        <w:pStyle w:val="Code"/>
+      </w:pPr>
+      <w:r>
+        <w:t>nano analysis.txt</w:t>
+      </w:r>
+    </w:p>
+    <w:p>
+      <w:r>
+        <w:t>Nhap dung 4 dong sau:</w:t>
       </w:r>
     </w:p>
     <w:p>
@@ -1498,11 +890,111 @@
       </w:r>
     </w:p>
     <w:p>
-      <w:pPr>
-        <w:pStyle w:val="Heading1"/>
-      </w:pPr>
       <w:r>
-        <w:t>11. Chạy checkwork</w:t>
+        <w:t>Luu file:</w:t>
+      </w:r>
+    </w:p>
+    <w:p>
+      <w:pPr>
+        <w:pStyle w:val="ListBullet"/>
+      </w:pPr>
+      <w:r>
+        <w:t>Nhan Ctrl+O</w:t>
+      </w:r>
+    </w:p>
+    <w:p>
+      <w:pPr>
+        <w:pStyle w:val="ListBullet"/>
+      </w:pPr>
+      <w:r>
+        <w:t>Nhan Enter</w:t>
+      </w:r>
+    </w:p>
+    <w:p>
+      <w:pPr>
+        <w:pStyle w:val="ListBullet"/>
+      </w:pPr>
+      <w:r>
+        <w:t>Nhan Ctrl+X</w:t>
+      </w:r>
+    </w:p>
+    <w:p>
+      <w:r>
+        <w:t>Kiem tra:</w:t>
+      </w:r>
+    </w:p>
+    <w:p>
+      <w:pPr>
+        <w:pStyle w:val="Code"/>
+      </w:pPr>
+      <w:r>
+        <w:t>cat analysis.txt</w:t>
+      </w:r>
+    </w:p>
+    <w:p>
+      <w:r>
+        <w:t>Giai thich:</w:t>
+      </w:r>
+    </w:p>
+    <w:p>
+      <w:pPr>
+        <w:pStyle w:val="ListBullet"/>
+      </w:pPr>
+      <w:r>
+        <w:t>Anh cover.png co kich thuoc 256x256.</w:t>
+      </w:r>
+    </w:p>
+    <w:p>
+      <w:pPr>
+        <w:pStyle w:val="ListBullet"/>
+      </w:pPr>
+      <w:r>
+        <w:t>Anh RGB co 3 kenh mau R, G, B.</w:t>
+      </w:r>
+    </w:p>
+    <w:p>
+      <w:pPr>
+        <w:pStyle w:val="ListBullet"/>
+      </w:pPr>
+      <w:r>
+        <w:t>Moi kenh giau duoc 1 bit.</w:t>
+      </w:r>
+    </w:p>
+    <w:p>
+      <w:pPr>
+        <w:pStyle w:val="ListBullet"/>
+      </w:pPr>
+      <w:r>
+        <w:t>capacity_bits = 256 * 256 * 3 = 196608.</w:t>
+      </w:r>
+    </w:p>
+    <w:p>
+      <w:pPr>
+        <w:pStyle w:val="ListBullet"/>
+      </w:pPr>
+      <w:r>
+        <w:t>capacity_bytes = 196608 / 8 = 24576.</w:t>
+      </w:r>
+    </w:p>
+    <w:p>
+      <w:pPr>
+        <w:pStyle w:val="ListBullet"/>
+      </w:pPr>
+      <w:r>
+        <w:t>header_bytes = MAGIC 8 + LENGTH 4 + SHA256 32 = 44.</w:t>
+      </w:r>
+    </w:p>
+    <w:p>
+      <w:pPr>
+        <w:pStyle w:val="ListBullet"/>
+      </w:pPr>
+      <w:r>
+        <w:t>max_payload_bytes = 24576 - 44 = 24532.</w:t>
+      </w:r>
+    </w:p>
+    <w:p>
+      <w:r>
+        <w:t>Chay:</w:t>
       </w:r>
     </w:p>
     <w:p>
@@ -1515,7 +1007,7 @@
     </w:p>
     <w:p>
       <w:r>
-        <w:t>Kết quả mong muốn:</w:t>
+        <w:t>Ket qua dung:</w:t>
       </w:r>
     </w:p>
     <w:p>
@@ -1576,7 +1068,52 @@
     </w:p>
     <w:p>
       <w:r>
-        <w:t>Có thể chạy checkwork của Labtainer:</w:t>
+        <w:t>Neu van fail:</w:t>
+      </w:r>
+    </w:p>
+    <w:p>
+      <w:pPr>
+        <w:pStyle w:val="ListBullet"/>
+      </w:pPr>
+      <w:r>
+        <w:t>Doc task nao FAIL.</w:t>
+      </w:r>
+    </w:p>
+    <w:p>
+      <w:pPr>
+        <w:pStyle w:val="ListBullet"/>
+      </w:pPr>
+      <w:r>
+        <w:t>Xem file log tuong ung:</w:t>
+      </w:r>
+    </w:p>
+    <w:p>
+      <w:pPr>
+        <w:pStyle w:val="Code"/>
+      </w:pPr>
+      <w:r>
+        <w:t>cat encode.log</w:t>
+      </w:r>
+    </w:p>
+    <w:p>
+      <w:pPr>
+        <w:pStyle w:val="Code"/>
+      </w:pPr>
+      <w:r>
+        <w:t>cat decode.log</w:t>
+      </w:r>
+    </w:p>
+    <w:p>
+      <w:pPr>
+        <w:pStyle w:val="Code"/>
+      </w:pPr>
+      <w:r>
+        <w:t>cat no_header.log</w:t>
+      </w:r>
+    </w:p>
+    <w:p>
+      <w:r>
+        <w:t>Chay:</w:t>
       </w:r>
     </w:p>
     <w:p>
@@ -1588,144 +1125,69 @@
       </w:r>
     </w:p>
     <w:p>
-      <w:pPr>
-        <w:pStyle w:val="Heading1"/>
-      </w:pPr>
       <w:r>
-        <w:t>12. Lỗi Thường Gặp</w:t>
+        <w:t>Ket qua dung:</w:t>
       </w:r>
     </w:p>
     <w:p>
       <w:pPr>
-        <w:pStyle w:val="ListBullet"/>
+        <w:pStyle w:val="Code"/>
       </w:pPr>
       <w:r>
-        <w:t>Sai thứ tự bit: byte phải được tách từ bit 7 về bit 0.</w:t>
+        <w:t>Y - Task_1_Encode_image</w:t>
       </w:r>
     </w:p>
     <w:p>
       <w:pPr>
-        <w:pStyle w:val="ListBullet"/>
+        <w:pStyle w:val="Code"/>
       </w:pPr>
       <w:r>
-        <w:t>Sai endian của LENGTH: phải dùng big-endian với struct.pack("&gt;I", length).</w:t>
+        <w:t>Y - Task_2_Detect_secret_header</w:t>
       </w:r>
     </w:p>
     <w:p>
       <w:pPr>
-        <w:pStyle w:val="ListBullet"/>
+        <w:pStyle w:val="Code"/>
       </w:pPr>
       <w:r>
-        <w:t>Không convert ảnh sang RGB: luôn dùng Image.open(path).convert("RGB").</w:t>
+        <w:t>Y - Task_3_Verify_SHA256</w:t>
       </w:r>
     </w:p>
     <w:p>
       <w:pPr>
-        <w:pStyle w:val="ListBullet"/>
+        <w:pStyle w:val="Code"/>
       </w:pPr>
       <w:r>
-        <w:t>Ghi sai file output: encode tạo encoded.png, decode tạo recovered.txt.</w:t>
+        <w:t>Y - Task_4_Recover_original_message</w:t>
       </w:r>
     </w:p>
     <w:p>
       <w:pPr>
-        <w:pStyle w:val="ListBullet"/>
+        <w:pStyle w:val="Code"/>
       </w:pPr>
       <w:r>
-        <w:t>Negative test sai: ảnh không có MAGIC phải in NO_SECRET_HEADER.</w:t>
+        <w:t>Y - Task_5_Detect_image_without_secret</w:t>
       </w:r>
     </w:p>
     <w:p>
       <w:pPr>
-        <w:pStyle w:val="ListBullet"/>
+        <w:pStyle w:val="Code"/>
       </w:pPr>
       <w:r>
-        <w:t>Task 6 không pass: analysis.txt phải có đúng tên key và đúng giá trị.</w:t>
+        <w:t>Y - Task_6_Calculate_capacity</w:t>
       </w:r>
     </w:p>
     <w:p>
       <w:pPr>
-        <w:pStyle w:val="Heading1"/>
+        <w:pStyle w:val="Code"/>
       </w:pPr>
       <w:r>
-        <w:t>13. Câu Hỏi Báo Cáo</w:t>
-      </w:r>
-    </w:p>
-    <w:p>
-      <w:pPr>
-        <w:pStyle w:val="ListNumber"/>
-      </w:pPr>
-      <w:r>
-        <w:t>Kỹ thuật LSB là gì?</w:t>
-      </w:r>
-    </w:p>
-    <w:p>
-      <w:pPr>
-        <w:pStyle w:val="ListNumber"/>
-      </w:pPr>
-      <w:r>
-        <w:t>Vì sao ảnh sau khi giấu tin nhìn gần giống ảnh gốc?</w:t>
-      </w:r>
-    </w:p>
-    <w:p>
-      <w:pPr>
-        <w:pStyle w:val="ListNumber"/>
-      </w:pPr>
-      <w:r>
-        <w:t>Header PTITLSB1 dùng để làm gì?</w:t>
-      </w:r>
-    </w:p>
-    <w:p>
-      <w:pPr>
-        <w:pStyle w:val="ListNumber"/>
-      </w:pPr>
-      <w:r>
-        <w:t>Vì sao cần trường LENGTH?</w:t>
-      </w:r>
-    </w:p>
-    <w:p>
-      <w:pPr>
-        <w:pStyle w:val="ListNumber"/>
-      </w:pPr>
-      <w:r>
-        <w:t>SHA-256 trong bài lab có tác dụng gì?</w:t>
-      </w:r>
-    </w:p>
-    <w:p>
-      <w:pPr>
-        <w:pStyle w:val="ListNumber"/>
-      </w:pPr>
-      <w:r>
-        <w:t>Công thức tính dung lượng giấu tin tối đa của ảnh RGB là gì?</w:t>
-      </w:r>
-    </w:p>
-    <w:p>
-      <w:pPr>
-        <w:pStyle w:val="ListNumber"/>
-      </w:pPr>
-      <w:r>
-        <w:t>Nếu ảnh là 256x256 RGB thì giấu được tối đa bao nhiêu byte payload?</w:t>
-      </w:r>
-    </w:p>
-    <w:p>
-      <w:pPr>
-        <w:pStyle w:val="ListNumber"/>
-      </w:pPr>
-      <w:r>
-        <w:t>Kỹ thuật LSB có an toàn tuyệt đối không? Vì sao?</w:t>
-      </w:r>
-    </w:p>
-    <w:p>
-      <w:pPr>
-        <w:pStyle w:val="Heading1"/>
-      </w:pPr>
-      <w:r>
-        <w:t>14. Dừng Lab Và Nộp Bài</w:t>
+        <w:t>Y - All_tasks_completed</w:t>
       </w:r>
     </w:p>
     <w:p>
       <w:r>
-        <w:t>Sau khi làm xong và checkwork đã pass, dừng lab:</w:t>
+        <w:t>Sau khi checkwork da pass, chay:</w:t>
       </w:r>
     </w:p>
     <w:p>
@@ -1738,34 +1200,206 @@
     </w:p>
     <w:p>
       <w:r>
-        <w:t>Labtainer sẽ tạo file kết quả trong:</w:t>
+        <w:t>File nop bai nam trong:</w:t>
       </w:r>
     </w:p>
     <w:p>
-      <w:pPr>
-        <w:pStyle w:val="Code"/>
-      </w:pPr>
       <w:r>
         <w:t>~/labtainer_xfer/lsb-secret-header</w:t>
       </w:r>
     </w:p>
     <w:p>
       <w:r>
-        <w:t>Nếu giảng viên yêu cầu nộp file .lab, nộp file có dạng:</w:t>
+        <w:t>File can nop co dang:</w:t>
       </w:r>
     </w:p>
     <w:p>
-      <w:pPr>
-        <w:pStyle w:val="Code"/>
-      </w:pPr>
       <w:r>
         <w:t>&lt;student_id&gt;.lsb-secret-header.lab</w:t>
+      </w:r>
+    </w:p>
+    <w:p>
+      <w:pPr>
+        <w:pStyle w:val="ListNumber"/>
+      </w:pPr>
+      <w:r>
+        <w:t>Khong thay encoded.png</w:t>
+      </w:r>
+    </w:p>
+    <w:p>
+      <w:r>
+        <w:t xml:space="preserve">   Binh thuong neu ban chua chay:</w:t>
+      </w:r>
+    </w:p>
+    <w:p>
+      <w:r>
+        <w:t xml:space="preserve">   python3 encode.py cover.png secret.txt encoded.png</w:t>
+      </w:r>
+    </w:p>
+    <w:p>
+      <w:pPr>
+        <w:pStyle w:val="ListNumber"/>
+      </w:pPr>
+      <w:r>
+        <w:t>Khong thay recovered.txt</w:t>
+      </w:r>
+    </w:p>
+    <w:p>
+      <w:r>
+        <w:t xml:space="preserve">   Binh thuong neu ban chua chay:</w:t>
+      </w:r>
+    </w:p>
+    <w:p>
+      <w:r>
+        <w:t xml:space="preserve">   python3 decode.py encoded.png recovered.txt</w:t>
+      </w:r>
+    </w:p>
+    <w:p>
+      <w:pPr>
+        <w:pStyle w:val="ListNumber"/>
+      </w:pPr>
+      <w:r>
+        <w:t>encode.py bao NotImplementedError</w:t>
+      </w:r>
+    </w:p>
+    <w:p>
+      <w:r>
+        <w:t xml:space="preserve">   Ban chua thay het cac ham TODO trong encode.py.</w:t>
+      </w:r>
+    </w:p>
+    <w:p>
+      <w:pPr>
+        <w:pStyle w:val="ListNumber"/>
+      </w:pPr>
+      <w:r>
+        <w:t>decode.py bao NotImplementedError</w:t>
+      </w:r>
+    </w:p>
+    <w:p>
+      <w:r>
+        <w:t xml:space="preserve">   Ban chua thay het cac ham TODO trong decode.py.</w:t>
+      </w:r>
+    </w:p>
+    <w:p>
+      <w:pPr>
+        <w:pStyle w:val="ListNumber"/>
+      </w:pPr>
+      <w:r>
+        <w:t>HEADER fail</w:t>
+      </w:r>
+    </w:p>
+    <w:p>
+      <w:r>
+        <w:t xml:space="preserve">   Co the do encode sai thu tu bit. Khi tach byte thanh bit phai di tu bit 7 ve bit 0.</w:t>
+      </w:r>
+    </w:p>
+    <w:p>
+      <w:pPr>
+        <w:pStyle w:val="ListNumber"/>
+      </w:pPr>
+      <w:r>
+        <w:t>SHA256 fail</w:t>
+      </w:r>
+    </w:p>
+    <w:p>
+      <w:r>
+        <w:t xml:space="preserve">   Co the do doc sai LENGTH, sai endian, hoac ghep byte sai thu tu bit.</w:t>
+      </w:r>
+    </w:p>
+    <w:p>
+      <w:pPr>
+        <w:pStyle w:val="ListNumber"/>
+      </w:pPr>
+      <w:r>
+        <w:t>Negative test fail</w:t>
+      </w:r>
+    </w:p>
+    <w:p>
+      <w:r>
+        <w:t xml:space="preserve">   Khi magic != MAGIC, phai print NO_SECRET_HEADER va thoat ngay.</w:t>
+      </w:r>
+    </w:p>
+    <w:p>
+      <w:pPr>
+        <w:pStyle w:val="ListNumber"/>
+      </w:pPr>
+      <w:r>
+        <w:t>Task 6 fail</w:t>
+      </w:r>
+    </w:p>
+    <w:p>
+      <w:r>
+        <w:t xml:space="preserve">   Kiem tra analysis.txt co dung ten file, dung 4 dong, dung gia tri va khong viet sai key.</w:t>
+      </w:r>
+    </w:p>
+    <w:p>
+      <w:pPr>
+        <w:pStyle w:val="ListNumber"/>
+      </w:pPr>
+      <w:r>
+        <w:t>Ky thuat LSB la gi?</w:t>
+      </w:r>
+    </w:p>
+    <w:p>
+      <w:pPr>
+        <w:pStyle w:val="ListNumber"/>
+      </w:pPr>
+      <w:r>
+        <w:t>Vi sao anh sau khi giau tin nhin gan giong anh goc?</w:t>
+      </w:r>
+    </w:p>
+    <w:p>
+      <w:pPr>
+        <w:pStyle w:val="ListNumber"/>
+      </w:pPr>
+      <w:r>
+        <w:t>Header PTITLSB1 dung de lam gi?</w:t>
+      </w:r>
+    </w:p>
+    <w:p>
+      <w:pPr>
+        <w:pStyle w:val="ListNumber"/>
+      </w:pPr>
+      <w:r>
+        <w:t>Vi sao can truong LENGTH?</w:t>
+      </w:r>
+    </w:p>
+    <w:p>
+      <w:pPr>
+        <w:pStyle w:val="ListNumber"/>
+      </w:pPr>
+      <w:r>
+        <w:t>SHA-256 trong bai lab co tac dung gi?</w:t>
+      </w:r>
+    </w:p>
+    <w:p>
+      <w:pPr>
+        <w:pStyle w:val="ListNumber"/>
+      </w:pPr>
+      <w:r>
+        <w:t>Cong thuc tinh dung luong giau tin toi da cua anh RGB la gi?</w:t>
+      </w:r>
+    </w:p>
+    <w:p>
+      <w:pPr>
+        <w:pStyle w:val="ListNumber"/>
+      </w:pPr>
+      <w:r>
+        <w:t>Anh 256x256 RGB giau duoc toi da bao nhieu byte payload?</w:t>
+      </w:r>
+    </w:p>
+    <w:p>
+      <w:pPr>
+        <w:pStyle w:val="ListNumber"/>
+      </w:pPr>
+      <w:r>
+        <w:t>Ky thuat LSB co an toan tuyet doi khong? Vi sao?</w:t>
       </w:r>
     </w:p>
     <w:sectPr>
       <w:footerReference w:type="default" r:id="rId9"/>
       <w:pgSz w:w="12240" w:h="15840"/>
-      <w:pgMar w:top="1440" w:right="1440" w:bottom="1440" w:left="1440" w:header="708" w:footer="708" w:gutter="0"/>
+      <w:pgMar w:top="1440" w:right="1440" w:bottom="1440" w:left="1440" w:header="720" w:footer="720" w:gutter="0"/>
       <w:cols w:space="720"/>
       <w:docGrid w:linePitch="360"/>
     </w:sectPr>
@@ -1781,7 +1415,7 @@
       <w:jc w:val="right"/>
     </w:pPr>
     <w:r>
-      <w:t>lsb-secret-header student guide</w:t>
+      <w:t>lsb-secret-header step-by-step guide</w:t>
     </w:r>
   </w:p>
 </w:ftr>
@@ -2151,7 +1785,7 @@
     <w:qFormat/>
     <w:rsid w:val="00FC693F"/>
     <w:pPr>
-      <w:spacing w:after="120" w:line="300" w:lineRule="auto"/>
+      <w:spacing w:after="120" w:line="283" w:lineRule="auto"/>
     </w:pPr>
     <w:rPr>
       <w:rFonts w:ascii="Calibri" w:hAnsi="Calibri"/>
@@ -2213,7 +1847,7 @@
     <w:pPr>
       <w:keepNext/>
       <w:keepLines/>
-      <w:spacing w:before="360" w:after="200"/>
+      <w:spacing w:before="240" w:after="120"/>
       <w:outlineLvl w:val="0"/>
     </w:pPr>
     <w:rPr>
@@ -2221,7 +1855,7 @@
       <w:b/>
       <w:bCs/>
       <w:color w:val="2E74B5"/>
-      <w:sz w:val="32"/>
+      <w:sz w:val="30"/>
       <w:szCs w:val="28"/>
     </w:rPr>
   </w:style>
@@ -2237,15 +1871,15 @@
     <w:pPr>
       <w:keepNext/>
       <w:keepLines/>
-      <w:spacing w:before="280" w:after="140"/>
+      <w:spacing w:before="240" w:after="120"/>
       <w:outlineLvl w:val="1"/>
     </w:pPr>
     <w:rPr>
       <w:rFonts w:asciiTheme="majorHAnsi" w:eastAsiaTheme="majorEastAsia" w:hAnsiTheme="majorHAnsi" w:cstheme="majorBidi" w:ascii="Calibri" w:hAnsi="Calibri"/>
       <w:b/>
       <w:bCs/>
-      <w:color w:val="2E74B5"/>
-      <w:sz w:val="26"/>
+      <w:color w:val="1F4D78"/>
+      <w:sz w:val="24"/>
       <w:szCs w:val="26"/>
     </w:rPr>
   </w:style>
@@ -2261,15 +1895,14 @@
     <w:pPr>
       <w:keepNext/>
       <w:keepLines/>
-      <w:spacing w:before="200" w:after="100"/>
+      <w:spacing w:before="200" w:after="0"/>
       <w:outlineLvl w:val="2"/>
     </w:pPr>
     <w:rPr>
-      <w:rFonts w:asciiTheme="majorHAnsi" w:eastAsiaTheme="majorEastAsia" w:hAnsiTheme="majorHAnsi" w:cstheme="majorBidi" w:ascii="Calibri" w:hAnsi="Calibri"/>
+      <w:rFonts w:asciiTheme="majorHAnsi" w:eastAsiaTheme="majorEastAsia" w:hAnsiTheme="majorHAnsi" w:cstheme="majorBidi"/>
       <w:b/>
       <w:bCs/>
-      <w:color w:val="1F4D78"/>
-      <w:sz w:val="24"/>
+      <w:color w:val="4F81BD" w:themeColor="accent1"/>
     </w:rPr>
   </w:style>
   <w:style w:type="paragraph" w:styleId="Heading4">
@@ -2503,7 +2136,7 @@
       <w:pBdr>
         <w:bottom w:val="single" w:sz="8" w:space="4" w:color="4F81BD" w:themeColor="accent1"/>
       </w:pBdr>
-      <w:spacing w:after="160" w:line="240" w:lineRule="auto"/>
+      <w:spacing w:after="300" w:line="240" w:lineRule="auto"/>
       <w:contextualSpacing/>
     </w:pPr>
     <w:rPr>
@@ -2543,13 +2176,12 @@
       <w:numPr>
         <w:ilvl w:val="1"/>
       </w:numPr>
-      <w:spacing w:after="240"/>
     </w:pPr>
     <w:rPr>
-      <w:rFonts w:asciiTheme="majorHAnsi" w:eastAsiaTheme="majorEastAsia" w:hAnsiTheme="majorHAnsi" w:cstheme="majorBidi" w:ascii="Calibri" w:hAnsi="Calibri"/>
+      <w:rFonts w:asciiTheme="majorHAnsi" w:eastAsiaTheme="majorEastAsia" w:hAnsiTheme="majorHAnsi" w:cstheme="majorBidi"/>
       <w:i/>
       <w:iCs/>
-      <w:color w:val="505050"/>
+      <w:color w:val="4F81BD" w:themeColor="accent1"/>
       <w:spacing w:val="15"/>
       <w:sz w:val="24"/>
       <w:szCs w:val="24"/>
@@ -13846,12 +13478,12 @@
   <w:style w:type="paragraph" w:customStyle="1" w:styleId="Code">
     <w:name w:val="Code"/>
     <w:pPr>
-      <w:spacing w:after="0" w:line="240" w:lineRule="auto"/>
+      <w:spacing w:after="0"/>
       <w:ind w:left="259"/>
     </w:pPr>
     <w:rPr>
       <w:rFonts w:ascii="Consolas" w:hAnsi="Consolas"/>
-      <w:sz w:val="18"/>
+      <w:sz w:val="17"/>
     </w:rPr>
   </w:style>
 </w:styles>

</xml_diff>

<commit_message>
Rewrite guide in accented Vietnamese
</commit_message>
<xml_diff>
--- a/docs/lsb-secret-header-word-guide.docx
+++ b/docs/lsb-secret-header-word-guide.docx
@@ -23,17 +23,25 @@
     </w:p>
     <w:p>
       <w:r>
-        <w:t>HUONG DAN TUNG BUOC: LAB GIAU TIN BANG LSB + HEADER BI MAT</w:t>
+        <w:t>HƯỚNG DẪN TỪNG BƯỚC: GIẤU TIN BẰNG LSB + HEADER BÍ MẬT</w:t>
       </w:r>
     </w:p>
     <w:p>
       <w:r>
-        <w:t>Ten bai: lsb-secret-header</w:t>
+        <w:t>Tên bài: lsb-secret-header</w:t>
+      </w:r>
+    </w:p>
+    <w:p>
+      <w:pPr>
+        <w:pStyle w:val="Heading1"/>
+      </w:pPr>
+      <w:r>
+        <w:t>Lưu Ý Quan Trọng</w:t>
       </w:r>
     </w:p>
     <w:p>
       <w:r>
-        <w:t>QUAN TRONG: Khi moi mo lab, se CHUA CO encoded.png va recovered.txt.</w:t>
+        <w:t>Khi mới mở lab, sẽ CHƯA CÓ hai file encoded.png và recovered.txt.</w:t>
       </w:r>
     </w:p>
     <w:p>
@@ -41,7 +49,7 @@
         <w:pStyle w:val="ListBullet"/>
       </w:pPr>
       <w:r>
-        <w:t>encoded.png chi duoc tao sau khi ban sua xong encode.py va chay lenh encode.</w:t>
+        <w:t>encoded.png chỉ được tạo sau khi bạn sửa xong encode.py và chạy lệnh encode.</w:t>
       </w:r>
     </w:p>
     <w:p>
@@ -49,7 +57,7 @@
         <w:pStyle w:val="ListBullet"/>
       </w:pPr>
       <w:r>
-        <w:t>recovered.txt chi duoc tao sau khi ban sua xong decode.py va chay lenh decode.</w:t>
+        <w:t>recovered.txt chỉ được tạo sau khi bạn sửa xong decode.py và chạy lệnh decode.</w:t>
       </w:r>
     </w:p>
     <w:p>
@@ -57,35 +65,43 @@
         <w:pStyle w:val="ListBullet"/>
       </w:pPr>
       <w:r>
-        <w:t>check_work.sh cung se xoa file ket qua cu roi tao lai de cham.</w:t>
+        <w:t>check_work.sh sẽ xóa kết quả cũ rồi tạo lại kết quả mới để chấm.</w:t>
       </w:r>
     </w:p>
     <w:p>
       <w:r>
-        <w:t>RAW URL cai lab:</w:t>
+        <w:t>RAW URL cài lab:</w:t>
       </w:r>
     </w:p>
     <w:p>
+      <w:pPr>
+        <w:pStyle w:val="CodeBlock"/>
+      </w:pPr>
       <w:r>
         <w:t>https://github.com/vuxvinh/KiThuatGiauTin/raw/main/lsb-secret-header.tar</w:t>
       </w:r>
     </w:p>
     <w:p>
       <w:r>
-        <w:t>Chay:</w:t>
+        <w:t>Chạy lệnh sau để cài lab:</w:t>
       </w:r>
     </w:p>
     <w:p>
       <w:pPr>
-        <w:pStyle w:val="Code"/>
+        <w:pStyle w:val="CodeBlock"/>
       </w:pPr>
       <w:r>
         <w:t>imodule https://github.com/vuxvinh/KiThuatGiauTin/raw/main/lsb-secret-header.tar</w:t>
       </w:r>
     </w:p>
     <w:p>
-      <w:pPr>
-        <w:pStyle w:val="Code"/>
+      <w:r>
+        <w:t>Mở lab:</w:t>
+      </w:r>
+    </w:p>
+    <w:p>
+      <w:pPr>
+        <w:pStyle w:val="CodeBlock"/>
       </w:pPr>
       <w:r>
         <w:t>labtainer lsb-secret-header</w:t>
@@ -93,12 +109,12 @@
     </w:p>
     <w:p>
       <w:r>
-        <w:t>Neu muon lam lai tu dau:</w:t>
+        <w:t>Nếu muốn làm lại từ đầu:</w:t>
       </w:r>
     </w:p>
     <w:p>
       <w:pPr>
-        <w:pStyle w:val="Code"/>
+        <w:pStyle w:val="CodeBlock"/>
       </w:pPr>
       <w:r>
         <w:t>labtainer -r lsb-secret-header</w:t>
@@ -106,12 +122,12 @@
     </w:p>
     <w:p>
       <w:r>
-        <w:t>Kiem tra file ban dau:</w:t>
+        <w:t>Kiểm tra các file ban đầu:</w:t>
       </w:r>
     </w:p>
     <w:p>
       <w:pPr>
-        <w:pStyle w:val="Code"/>
+        <w:pStyle w:val="CodeBlock"/>
       </w:pPr>
       <w:r>
         <w:t>ls</w:t>
@@ -119,12 +135,12 @@
     </w:p>
     <w:p>
       <w:r>
-        <w:t>Ban se thay cac file:</w:t>
+        <w:t>Bạn cần thấy các file:</w:t>
       </w:r>
     </w:p>
     <w:p>
       <w:pPr>
-        <w:pStyle w:val="Code"/>
+        <w:pStyle w:val="CodeBlock"/>
       </w:pPr>
       <w:r>
         <w:t>README.md</w:t>
@@ -132,7 +148,7 @@
     </w:p>
     <w:p>
       <w:pPr>
-        <w:pStyle w:val="Code"/>
+        <w:pStyle w:val="CodeBlock"/>
       </w:pPr>
       <w:r>
         <w:t>cover.png</w:t>
@@ -140,7 +156,7 @@
     </w:p>
     <w:p>
       <w:pPr>
-        <w:pStyle w:val="Code"/>
+        <w:pStyle w:val="CodeBlock"/>
       </w:pPr>
       <w:r>
         <w:t>no_secret.png</w:t>
@@ -148,7 +164,7 @@
     </w:p>
     <w:p>
       <w:pPr>
-        <w:pStyle w:val="Code"/>
+        <w:pStyle w:val="CodeBlock"/>
       </w:pPr>
       <w:r>
         <w:t>secret.txt</w:t>
@@ -156,7 +172,7 @@
     </w:p>
     <w:p>
       <w:pPr>
-        <w:pStyle w:val="Code"/>
+        <w:pStyle w:val="CodeBlock"/>
       </w:pPr>
       <w:r>
         <w:t>encode.py</w:t>
@@ -164,7 +180,7 @@
     </w:p>
     <w:p>
       <w:pPr>
-        <w:pStyle w:val="Code"/>
+        <w:pStyle w:val="CodeBlock"/>
       </w:pPr>
       <w:r>
         <w:t>decode.py</w:t>
@@ -172,7 +188,7 @@
     </w:p>
     <w:p>
       <w:pPr>
-        <w:pStyle w:val="Code"/>
+        <w:pStyle w:val="CodeBlock"/>
       </w:pPr>
       <w:r>
         <w:t>check_work.sh</w:t>
@@ -180,7 +196,7 @@
     </w:p>
     <w:p>
       <w:pPr>
-        <w:pStyle w:val="Code"/>
+        <w:pStyle w:val="CodeBlock"/>
       </w:pPr>
       <w:r>
         <w:t>make_assets.py</w:t>
@@ -188,17 +204,17 @@
     </w:p>
     <w:p>
       <w:r>
-        <w:t>Neu khong thay encoded.png hoac recovered.txt luc nay thi DUNG. Hai file do chua duoc tao.</w:t>
+        <w:t>Nếu chưa thấy encoded.png hoặc recovered.txt ở bước này thì hoàn toàn bình thường. Hai file đó chưa được tạo.</w:t>
       </w:r>
     </w:p>
     <w:p>
       <w:r>
-        <w:t>Chay:</w:t>
+        <w:t>Chạy:</w:t>
       </w:r>
     </w:p>
     <w:p>
       <w:pPr>
-        <w:pStyle w:val="Code"/>
+        <w:pStyle w:val="CodeBlock"/>
       </w:pPr>
       <w:r>
         <w:t>bash check_work.sh</w:t>
@@ -206,12 +222,12 @@
     </w:p>
     <w:p>
       <w:r>
-        <w:t>Luc chua sua code, ket qua se FAIL. Day la binh thuong.</w:t>
+        <w:t>Khi chưa sửa code, các task sẽ FAIL. Đây là kết quả đúng ở trạng thái ban đầu.</w:t>
       </w:r>
     </w:p>
     <w:p>
       <w:r>
-        <w:t>Ly do:</w:t>
+        <w:t>Lý do:</w:t>
       </w:r>
     </w:p>
     <w:p>
@@ -219,7 +235,7 @@
         <w:pStyle w:val="ListBullet"/>
       </w:pPr>
       <w:r>
-        <w:t>encode.py con TODO nen chua tao encoded.png.</w:t>
+        <w:t>encode.py còn TODO nên chưa tạo được encoded.png.</w:t>
       </w:r>
     </w:p>
     <w:p>
@@ -227,7 +243,7 @@
         <w:pStyle w:val="ListBullet"/>
       </w:pPr>
       <w:r>
-        <w:t>decode.py con TODO nen chua tao recovered.txt.</w:t>
+        <w:t>decode.py còn TODO nên chưa tạo được recovered.txt.</w:t>
       </w:r>
     </w:p>
     <w:p>
@@ -235,17 +251,17 @@
         <w:pStyle w:val="ListBullet"/>
       </w:pPr>
       <w:r>
-        <w:t>analysis.txt chua duoc tao.</w:t>
+        <w:t>analysis.txt chưa được tạo.</w:t>
       </w:r>
     </w:p>
     <w:p>
       <w:r>
-        <w:t>Mo file:</w:t>
+        <w:t>Mở file:</w:t>
       </w:r>
     </w:p>
     <w:p>
       <w:pPr>
-        <w:pStyle w:val="Code"/>
+        <w:pStyle w:val="CodeBlock"/>
       </w:pPr>
       <w:r>
         <w:t>nano encode.py</w:t>
@@ -253,12 +269,12 @@
     </w:p>
     <w:p>
       <w:r>
-        <w:t>Trong encode.py, tim ham build_packet(payload) va thay toan bo phan than ham bang:</w:t>
+        <w:t>Trong encode.py, tìm hàm build_packet(payload) và thay toàn bộ thân hàm bằng:</w:t>
       </w:r>
     </w:p>
     <w:p>
       <w:pPr>
-        <w:pStyle w:val="Code"/>
+        <w:pStyle w:val="CodeBlock"/>
       </w:pPr>
       <w:r>
         <w:t>def build_packet(payload: bytes) -&gt; bytes:</w:t>
@@ -266,7 +282,7 @@
     </w:p>
     <w:p>
       <w:pPr>
-        <w:pStyle w:val="Code"/>
+        <w:pStyle w:val="CodeBlock"/>
       </w:pPr>
       <w:r>
         <w:t xml:space="preserve">    length_bytes = struct.pack("&gt;I", len(payload))</w:t>
@@ -274,7 +290,7 @@
     </w:p>
     <w:p>
       <w:pPr>
-        <w:pStyle w:val="Code"/>
+        <w:pStyle w:val="CodeBlock"/>
       </w:pPr>
       <w:r>
         <w:t xml:space="preserve">    digest = hashlib.sha256(payload).digest()</w:t>
@@ -282,7 +298,7 @@
     </w:p>
     <w:p>
       <w:pPr>
-        <w:pStyle w:val="Code"/>
+        <w:pStyle w:val="CodeBlock"/>
       </w:pPr>
       <w:r>
         <w:t xml:space="preserve">    return MAGIC + length_bytes + digest + payload</w:t>
@@ -290,12 +306,12 @@
     </w:p>
     <w:p>
       <w:r>
-        <w:t>Tim ham capacity_bits(img) va thay bang:</w:t>
+        <w:t>Tìm hàm capacity_bits(img) và thay toàn bộ thân hàm bằng:</w:t>
       </w:r>
     </w:p>
     <w:p>
       <w:pPr>
-        <w:pStyle w:val="Code"/>
+        <w:pStyle w:val="CodeBlock"/>
       </w:pPr>
       <w:r>
         <w:t>def capacity_bits(img: Image.Image) -&gt; int:</w:t>
@@ -303,7 +319,7 @@
     </w:p>
     <w:p>
       <w:pPr>
-        <w:pStyle w:val="Code"/>
+        <w:pStyle w:val="CodeBlock"/>
       </w:pPr>
       <w:r>
         <w:t xml:space="preserve">    return img.width * img.height * 3</w:t>
@@ -311,12 +327,12 @@
     </w:p>
     <w:p>
       <w:r>
-        <w:t>Tim ham embed_packet(img, packet) va thay bang:</w:t>
+        <w:t>Tìm hàm embed_packet(img, packet) và thay toàn bộ thân hàm bằng:</w:t>
       </w:r>
     </w:p>
     <w:p>
       <w:pPr>
-        <w:pStyle w:val="Code"/>
+        <w:pStyle w:val="CodeBlock"/>
       </w:pPr>
       <w:r>
         <w:t>def embed_packet(img: Image.Image, packet: bytes) -&gt; Image.Image:</w:t>
@@ -324,7 +340,7 @@
     </w:p>
     <w:p>
       <w:pPr>
-        <w:pStyle w:val="Code"/>
+        <w:pStyle w:val="CodeBlock"/>
       </w:pPr>
       <w:r>
         <w:t xml:space="preserve">    img = img.convert("RGB")</w:t>
@@ -332,85 +348,124 @@
     </w:p>
     <w:p>
       <w:pPr>
-        <w:pStyle w:val="Code"/>
+        <w:pStyle w:val="CodeBlock"/>
       </w:pPr>
       <w:r>
         <w:t xml:space="preserve">    pixels = list(img.getdata())</w:t>
       </w:r>
     </w:p>
     <w:p>
+      <w:pPr>
+        <w:pStyle w:val="CodeBlock"/>
+      </w:pPr>
       <w:r>
-        <w:t xml:space="preserve">    channels = []</w:t>
+        <w:t>channels = []</w:t>
       </w:r>
     </w:p>
     <w:p>
+      <w:pPr>
+        <w:pStyle w:val="CodeBlock"/>
+      </w:pPr>
       <w:r>
         <w:t xml:space="preserve">    for r, g, b in pixels:</w:t>
       </w:r>
     </w:p>
     <w:p>
+      <w:pPr>
+        <w:pStyle w:val="CodeBlock"/>
+      </w:pPr>
       <w:r>
         <w:t xml:space="preserve">        channels.extend([r, g, b])</w:t>
       </w:r>
     </w:p>
     <w:p>
       <w:r>
-        <w:t xml:space="preserve">    bits = list(bytes_to_bits(packet))</w:t>
+        <w:t>bits = list(bytes_to_bits(packet))</w:t>
       </w:r>
     </w:p>
     <w:p>
+      <w:pPr>
+        <w:pStyle w:val="CodeBlock"/>
+      </w:pPr>
       <w:r>
-        <w:t xml:space="preserve">    if len(bits) &gt; len(channels):</w:t>
+        <w:t>if len(bits) &gt; len(channels):</w:t>
       </w:r>
     </w:p>
     <w:p>
+      <w:pPr>
+        <w:pStyle w:val="CodeBlock"/>
+      </w:pPr>
       <w:r>
         <w:t xml:space="preserve">        raise ValueError("Packet is too large for this image")</w:t>
       </w:r>
     </w:p>
     <w:p>
+      <w:pPr>
+        <w:pStyle w:val="CodeBlock"/>
+      </w:pPr>
       <w:r>
-        <w:t xml:space="preserve">    for i, bit in enumerate(bits):</w:t>
+        <w:t>for i, bit in enumerate(bits):</w:t>
       </w:r>
     </w:p>
     <w:p>
+      <w:pPr>
+        <w:pStyle w:val="CodeBlock"/>
+      </w:pPr>
       <w:r>
         <w:t xml:space="preserve">        channels[i] = (channels[i] &amp; 0xFE) | bit</w:t>
       </w:r>
     </w:p>
     <w:p>
+      <w:pPr>
+        <w:pStyle w:val="CodeBlock"/>
+      </w:pPr>
       <w:r>
-        <w:t xml:space="preserve">    new_pixels = []</w:t>
+        <w:t>new_pixels = []</w:t>
       </w:r>
     </w:p>
     <w:p>
+      <w:pPr>
+        <w:pStyle w:val="CodeBlock"/>
+      </w:pPr>
       <w:r>
         <w:t xml:space="preserve">    for i in range(0, len(channels), 3):</w:t>
       </w:r>
     </w:p>
     <w:p>
+      <w:pPr>
+        <w:pStyle w:val="CodeBlock"/>
+      </w:pPr>
       <w:r>
         <w:t xml:space="preserve">        new_pixels.append((channels[i], channels[i + 1], channels[i + 2]))</w:t>
       </w:r>
     </w:p>
     <w:p>
+      <w:pPr>
+        <w:pStyle w:val="CodeBlock"/>
+      </w:pPr>
       <w:r>
-        <w:t xml:space="preserve">    out = Image.new("RGB", img.size)</w:t>
+        <w:t>out = Image.new("RGB", img.size)</w:t>
       </w:r>
     </w:p>
     <w:p>
+      <w:pPr>
+        <w:pStyle w:val="CodeBlock"/>
+      </w:pPr>
       <w:r>
         <w:t xml:space="preserve">    out.putdata(new_pixels)</w:t>
       </w:r>
     </w:p>
     <w:p>
+      <w:pPr>
+        <w:pStyle w:val="CodeBlock"/>
+      </w:pPr>
       <w:r>
         <w:t xml:space="preserve">    return out</w:t>
       </w:r>
     </w:p>
     <w:p>
       <w:r>
-        <w:t>Luu file trong nano:</w:t>
+        <w:t>Lưu file trong nano:</w:t>
       </w:r>
     </w:p>
     <w:p>
@@ -418,7 +473,7 @@
         <w:pStyle w:val="ListBullet"/>
       </w:pPr>
       <w:r>
-        <w:t>Nhan Ctrl+O</w:t>
+        <w:t>Nhấn Ctrl+O.</w:t>
       </w:r>
     </w:p>
     <w:p>
@@ -426,7 +481,7 @@
         <w:pStyle w:val="ListBullet"/>
       </w:pPr>
       <w:r>
-        <w:t>Nhan Enter</w:t>
+        <w:t>Nhấn Enter.</w:t>
       </w:r>
     </w:p>
     <w:p>
@@ -434,17 +489,17 @@
         <w:pStyle w:val="ListBullet"/>
       </w:pPr>
       <w:r>
-        <w:t>Nhan Ctrl+X</w:t>
+        <w:t>Nhấn Ctrl+X.</w:t>
       </w:r>
     </w:p>
     <w:p>
       <w:r>
-        <w:t>Kiem tra encode.py:</w:t>
+        <w:t>Kiểm tra encode.py:</w:t>
       </w:r>
     </w:p>
     <w:p>
       <w:pPr>
-        <w:pStyle w:val="Code"/>
+        <w:pStyle w:val="CodeBlock"/>
       </w:pPr>
       <w:r>
         <w:t>python3 encode.py cover.png secret.txt encoded.png</w:t>
@@ -452,17 +507,17 @@
     </w:p>
     <w:p>
       <w:r>
-        <w:t>Neu dung, se thay ENCODE_OK va luc nay moi co file encoded.png.</w:t>
+        <w:t>Nếu đúng, chương trình sẽ in ENCODE_OK. Lúc này file encoded.png mới được tạo.</w:t>
       </w:r>
     </w:p>
     <w:p>
       <w:r>
-        <w:t>Kiem tra:</w:t>
+        <w:t>Kiểm tra:</w:t>
       </w:r>
     </w:p>
     <w:p>
       <w:pPr>
-        <w:pStyle w:val="Code"/>
+        <w:pStyle w:val="CodeBlock"/>
       </w:pPr>
       <w:r>
         <w:t>ls -l encoded.png</w:t>
@@ -470,12 +525,12 @@
     </w:p>
     <w:p>
       <w:r>
-        <w:t>Mo file:</w:t>
+        <w:t>Mở file:</w:t>
       </w:r>
     </w:p>
     <w:p>
       <w:pPr>
-        <w:pStyle w:val="Code"/>
+        <w:pStyle w:val="CodeBlock"/>
       </w:pPr>
       <w:r>
         <w:t>nano decode.py</w:t>
@@ -483,12 +538,12 @@
     </w:p>
     <w:p>
       <w:r>
-        <w:t>Tim ham image_lsb_bits(img) va thay bang:</w:t>
+        <w:t>Tìm hàm image_lsb_bits(img) và thay toàn bộ thân hàm bằng:</w:t>
       </w:r>
     </w:p>
     <w:p>
       <w:pPr>
-        <w:pStyle w:val="Code"/>
+        <w:pStyle w:val="CodeBlock"/>
       </w:pPr>
       <w:r>
         <w:t>def image_lsb_bits(img: Image.Image):</w:t>
@@ -496,7 +551,7 @@
     </w:p>
     <w:p>
       <w:pPr>
-        <w:pStyle w:val="Code"/>
+        <w:pStyle w:val="CodeBlock"/>
       </w:pPr>
       <w:r>
         <w:t xml:space="preserve">    img = img.convert("RGB")</w:t>
@@ -504,7 +559,7 @@
     </w:p>
     <w:p>
       <w:pPr>
-        <w:pStyle w:val="Code"/>
+        <w:pStyle w:val="CodeBlock"/>
       </w:pPr>
       <w:r>
         <w:t xml:space="preserve">    for r, g, b in img.getdata():</w:t>
@@ -512,7 +567,7 @@
     </w:p>
     <w:p>
       <w:pPr>
-        <w:pStyle w:val="Code"/>
+        <w:pStyle w:val="CodeBlock"/>
       </w:pPr>
       <w:r>
         <w:t xml:space="preserve">        yield r &amp; 1</w:t>
@@ -520,7 +575,7 @@
     </w:p>
     <w:p>
       <w:pPr>
-        <w:pStyle w:val="Code"/>
+        <w:pStyle w:val="CodeBlock"/>
       </w:pPr>
       <w:r>
         <w:t xml:space="preserve">        yield g &amp; 1</w:t>
@@ -528,7 +583,7 @@
     </w:p>
     <w:p>
       <w:pPr>
-        <w:pStyle w:val="Code"/>
+        <w:pStyle w:val="CodeBlock"/>
       </w:pPr>
       <w:r>
         <w:t xml:space="preserve">        yield b &amp; 1</w:t>
@@ -536,12 +591,12 @@
     </w:p>
     <w:p>
       <w:r>
-        <w:t>Tim ham bits_to_bytes(bits) va thay bang:</w:t>
+        <w:t>Tìm hàm bits_to_bytes(bits) và thay toàn bộ thân hàm bằng:</w:t>
       </w:r>
     </w:p>
     <w:p>
       <w:pPr>
-        <w:pStyle w:val="Code"/>
+        <w:pStyle w:val="CodeBlock"/>
       </w:pPr>
       <w:r>
         <w:t>def bits_to_bytes(bits):</w:t>
@@ -549,65 +604,86 @@
     </w:p>
     <w:p>
       <w:pPr>
-        <w:pStyle w:val="Code"/>
+        <w:pStyle w:val="CodeBlock"/>
       </w:pPr>
       <w:r>
         <w:t xml:space="preserve">    data = bytearray()</w:t>
       </w:r>
     </w:p>
     <w:p>
+      <w:pPr>
+        <w:pStyle w:val="CodeBlock"/>
+      </w:pPr>
       <w:r>
-        <w:t xml:space="preserve">    for i in range(0, len(bits), 8):</w:t>
+        <w:t>for i in range(0, len(bits), 8):</w:t>
       </w:r>
     </w:p>
     <w:p>
+      <w:pPr>
+        <w:pStyle w:val="CodeBlock"/>
+      </w:pPr>
       <w:r>
         <w:t xml:space="preserve">        chunk = bits[i:i + 8]</w:t>
       </w:r>
     </w:p>
     <w:p>
+      <w:pPr>
+        <w:pStyle w:val="CodeBlock"/>
+      </w:pPr>
       <w:r>
-        <w:t xml:space="preserve">        if len(chunk) &lt; 8:</w:t>
+        <w:t>if len(chunk) &lt; 8:</w:t>
       </w:r>
     </w:p>
     <w:p>
+      <w:pPr>
+        <w:pStyle w:val="CodeBlock"/>
+      </w:pPr>
       <w:r>
         <w:t xml:space="preserve">            break</w:t>
       </w:r>
     </w:p>
     <w:p>
+      <w:pPr>
+        <w:pStyle w:val="CodeBlock"/>
+      </w:pPr>
       <w:r>
-        <w:t xml:space="preserve">        value = 0</w:t>
+        <w:t>value = 0</w:t>
       </w:r>
     </w:p>
     <w:p>
+      <w:pPr>
+        <w:pStyle w:val="CodeBlock"/>
+      </w:pPr>
       <w:r>
         <w:t xml:space="preserve">        for bit in chunk:</w:t>
       </w:r>
     </w:p>
     <w:p>
+      <w:pPr>
+        <w:pStyle w:val="CodeBlock"/>
+      </w:pPr>
       <w:r>
         <w:t xml:space="preserve">            value = (value &lt;&lt; 1) | bit</w:t>
       </w:r>
     </w:p>
     <w:p>
       <w:r>
-        <w:t xml:space="preserve">        data.append(value)</w:t>
+        <w:t>data.append(value)</w:t>
       </w:r>
     </w:p>
     <w:p>
       <w:r>
-        <w:t xml:space="preserve">    return bytes(data)</w:t>
+        <w:t>return bytes(data)</w:t>
       </w:r>
     </w:p>
     <w:p>
       <w:r>
-        <w:t>Tim ham read_bytes_from_lsb(img, nbytes) va thay bang:</w:t>
+        <w:t>Tìm hàm read_bytes_from_lsb(img, nbytes) và thay toàn bộ thân hàm bằng:</w:t>
       </w:r>
     </w:p>
     <w:p>
       <w:pPr>
-        <w:pStyle w:val="Code"/>
+        <w:pStyle w:val="CodeBlock"/>
       </w:pPr>
       <w:r>
         <w:t>def read_bytes_from_lsb(img: Image.Image, nbytes: int) -&gt; bytes:</w:t>
@@ -615,7 +691,7 @@
     </w:p>
     <w:p>
       <w:pPr>
-        <w:pStyle w:val="Code"/>
+        <w:pStyle w:val="CodeBlock"/>
       </w:pPr>
       <w:r>
         <w:t xml:space="preserve">    need_bits = nbytes * 8</w:t>
@@ -623,50 +699,68 @@
     </w:p>
     <w:p>
       <w:pPr>
-        <w:pStyle w:val="Code"/>
+        <w:pStyle w:val="CodeBlock"/>
       </w:pPr>
       <w:r>
         <w:t xml:space="preserve">    bits = []</w:t>
       </w:r>
     </w:p>
     <w:p>
+      <w:pPr>
+        <w:pStyle w:val="CodeBlock"/>
+      </w:pPr>
       <w:r>
-        <w:t xml:space="preserve">    for bit in image_lsb_bits(img):</w:t>
+        <w:t>for bit in image_lsb_bits(img):</w:t>
       </w:r>
     </w:p>
     <w:p>
+      <w:pPr>
+        <w:pStyle w:val="CodeBlock"/>
+      </w:pPr>
       <w:r>
         <w:t xml:space="preserve">        bits.append(bit)</w:t>
       </w:r>
     </w:p>
     <w:p>
+      <w:pPr>
+        <w:pStyle w:val="CodeBlock"/>
+      </w:pPr>
       <w:r>
-        <w:t xml:space="preserve">        if len(bits) == need_bits:</w:t>
+        <w:t>if len(bits) == need_bits:</w:t>
       </w:r>
     </w:p>
     <w:p>
+      <w:pPr>
+        <w:pStyle w:val="CodeBlock"/>
+      </w:pPr>
       <w:r>
         <w:t xml:space="preserve">            break</w:t>
       </w:r>
     </w:p>
     <w:p>
+      <w:pPr>
+        <w:pStyle w:val="CodeBlock"/>
+      </w:pPr>
       <w:r>
-        <w:t xml:space="preserve">    if len(bits) &lt; need_bits:</w:t>
+        <w:t>if len(bits) &lt; need_bits:</w:t>
       </w:r>
     </w:p>
     <w:p>
+      <w:pPr>
+        <w:pStyle w:val="CodeBlock"/>
+      </w:pPr>
       <w:r>
         <w:t xml:space="preserve">        raise ValueError("Image does not contain enough LSB bits")</w:t>
       </w:r>
     </w:p>
     <w:p>
       <w:r>
-        <w:t xml:space="preserve">    return bits_to_bytes(bits)</w:t>
+        <w:t>return bits_to_bytes(bits)</w:t>
       </w:r>
     </w:p>
     <w:p>
       <w:r>
-        <w:t>Luu file trong nano:</w:t>
+        <w:t>Lưu file trong nano:</w:t>
       </w:r>
     </w:p>
     <w:p>
@@ -674,7 +768,7 @@
         <w:pStyle w:val="ListBullet"/>
       </w:pPr>
       <w:r>
-        <w:t>Nhan Ctrl+O</w:t>
+        <w:t>Nhấn Ctrl+O.</w:t>
       </w:r>
     </w:p>
     <w:p>
@@ -682,7 +776,7 @@
         <w:pStyle w:val="ListBullet"/>
       </w:pPr>
       <w:r>
-        <w:t>Nhan Enter</w:t>
+        <w:t>Nhấn Enter.</w:t>
       </w:r>
     </w:p>
     <w:p>
@@ -690,17 +784,17 @@
         <w:pStyle w:val="ListBullet"/>
       </w:pPr>
       <w:r>
-        <w:t>Nhan Ctrl+X</w:t>
+        <w:t>Nhấn Ctrl+X.</w:t>
       </w:r>
     </w:p>
     <w:p>
       <w:r>
-        <w:t>Kiem tra decode.py:</w:t>
+        <w:t>Kiểm tra decode.py:</w:t>
       </w:r>
     </w:p>
     <w:p>
       <w:pPr>
-        <w:pStyle w:val="Code"/>
+        <w:pStyle w:val="CodeBlock"/>
       </w:pPr>
       <w:r>
         <w:t>python3 decode.py encoded.png recovered.txt</w:t>
@@ -708,12 +802,12 @@
     </w:p>
     <w:p>
       <w:r>
-        <w:t>Neu dung, se thay:</w:t>
+        <w:t>Nếu đúng, chương trình sẽ in:</w:t>
       </w:r>
     </w:p>
     <w:p>
       <w:pPr>
-        <w:pStyle w:val="Code"/>
+        <w:pStyle w:val="CodeBlock"/>
       </w:pPr>
       <w:r>
         <w:t>HEADER_OK</w:t>
@@ -721,7 +815,7 @@
     </w:p>
     <w:p>
       <w:pPr>
-        <w:pStyle w:val="Code"/>
+        <w:pStyle w:val="CodeBlock"/>
       </w:pPr>
       <w:r>
         <w:t>SHA256_OK</w:t>
@@ -729,7 +823,7 @@
     </w:p>
     <w:p>
       <w:pPr>
-        <w:pStyle w:val="Code"/>
+        <w:pStyle w:val="CodeBlock"/>
       </w:pPr>
       <w:r>
         <w:t>DECODE_OK</w:t>
@@ -737,17 +831,17 @@
     </w:p>
     <w:p>
       <w:r>
-        <w:t>Luc nay moi co file recovered.txt.</w:t>
+        <w:t>Lúc này file recovered.txt mới được tạo.</w:t>
       </w:r>
     </w:p>
     <w:p>
       <w:r>
-        <w:t>Kiem tra:</w:t>
+        <w:t>Kiểm tra nội dung file:</w:t>
       </w:r>
     </w:p>
     <w:p>
       <w:pPr>
-        <w:pStyle w:val="Code"/>
+        <w:pStyle w:val="CodeBlock"/>
       </w:pPr>
       <w:r>
         <w:t>ls -l recovered.txt</w:t>
@@ -755,7 +849,7 @@
     </w:p>
     <w:p>
       <w:pPr>
-        <w:pStyle w:val="Code"/>
+        <w:pStyle w:val="CodeBlock"/>
       </w:pPr>
       <w:r>
         <w:t>cat recovered.txt</w:t>
@@ -763,12 +857,12 @@
     </w:p>
     <w:p>
       <w:r>
-        <w:t>So sanh voi secret.txt:</w:t>
+        <w:t>So sánh recovered.txt với secret.txt:</w:t>
       </w:r>
     </w:p>
     <w:p>
       <w:pPr>
-        <w:pStyle w:val="Code"/>
+        <w:pStyle w:val="CodeBlock"/>
       </w:pPr>
       <w:r>
         <w:t>cmp secret.txt recovered.txt</w:t>
@@ -776,7 +870,7 @@
     </w:p>
     <w:p>
       <w:pPr>
-        <w:pStyle w:val="Code"/>
+        <w:pStyle w:val="CodeBlock"/>
       </w:pPr>
       <w:r>
         <w:t>echo $?</w:t>
@@ -784,17 +878,17 @@
     </w:p>
     <w:p>
       <w:r>
-        <w:t>Neu echo $? in ra 0 thi hai file giong nhau.</w:t>
+        <w:t>Nếu echo $? in ra 0 thì hai file giống nhau.</w:t>
       </w:r>
     </w:p>
     <w:p>
       <w:r>
-        <w:t>Chay:</w:t>
+        <w:t>Chạy:</w:t>
       </w:r>
     </w:p>
     <w:p>
       <w:pPr>
-        <w:pStyle w:val="Code"/>
+        <w:pStyle w:val="CodeBlock"/>
       </w:pPr>
       <w:r>
         <w:t>python3 decode.py no_secret.png recovered_empty.txt</w:t>
@@ -802,17 +896,20 @@
     </w:p>
     <w:p>
       <w:r>
-        <w:t>Ket qua dung:</w:t>
+        <w:t>Kết quả đúng:</w:t>
       </w:r>
     </w:p>
     <w:p>
+      <w:pPr>
+        <w:pStyle w:val="CodeBlock"/>
+      </w:pPr>
       <w:r>
         <w:t>NO_SECRET_HEADER</w:t>
       </w:r>
     </w:p>
     <w:p>
       <w:r>
-        <w:t>Ghi chu:</w:t>
+        <w:t>Ghi chú:</w:t>
       </w:r>
     </w:p>
     <w:p>
@@ -820,7 +917,7 @@
         <w:pStyle w:val="ListBullet"/>
       </w:pPr>
       <w:r>
-        <w:t>Lenh nay co the thoat voi ma loi 3.</w:t>
+        <w:t>Lệnh này có thể thoát với mã lỗi 3.</w:t>
       </w:r>
     </w:p>
     <w:p>
@@ -828,7 +925,7 @@
         <w:pStyle w:val="ListBullet"/>
       </w:pPr>
       <w:r>
-        <w:t>Dieu quan trong la output co NO_SECRET_HEADER.</w:t>
+        <w:t>Điều quan trọng là màn hình có dòng NO_SECRET_HEADER.</w:t>
       </w:r>
     </w:p>
     <w:p>
@@ -836,17 +933,17 @@
         <w:pStyle w:val="ListBullet"/>
       </w:pPr>
       <w:r>
-        <w:t>Khong can tao recovered_empty.txt.</w:t>
+        <w:t>Không bắt buộc phải tạo recovered_empty.txt.</w:t>
       </w:r>
     </w:p>
     <w:p>
       <w:r>
-        <w:t>Tao file:</w:t>
+        <w:t>Tạo file:</w:t>
       </w:r>
     </w:p>
     <w:p>
       <w:pPr>
-        <w:pStyle w:val="Code"/>
+        <w:pStyle w:val="CodeBlock"/>
       </w:pPr>
       <w:r>
         <w:t>nano analysis.txt</w:t>
@@ -854,12 +951,12 @@
     </w:p>
     <w:p>
       <w:r>
-        <w:t>Nhap dung 4 dong sau:</w:t>
+        <w:t>Nhập đúng 4 dòng sau:</w:t>
       </w:r>
     </w:p>
     <w:p>
       <w:pPr>
-        <w:pStyle w:val="Code"/>
+        <w:pStyle w:val="CodeBlock"/>
       </w:pPr>
       <w:r>
         <w:t>capacity_bits=196608</w:t>
@@ -867,7 +964,7 @@
     </w:p>
     <w:p>
       <w:pPr>
-        <w:pStyle w:val="Code"/>
+        <w:pStyle w:val="CodeBlock"/>
       </w:pPr>
       <w:r>
         <w:t>capacity_bytes=24576</w:t>
@@ -875,7 +972,7 @@
     </w:p>
     <w:p>
       <w:pPr>
-        <w:pStyle w:val="Code"/>
+        <w:pStyle w:val="CodeBlock"/>
       </w:pPr>
       <w:r>
         <w:t>header_bytes=44</w:t>
@@ -883,7 +980,7 @@
     </w:p>
     <w:p>
       <w:pPr>
-        <w:pStyle w:val="Code"/>
+        <w:pStyle w:val="CodeBlock"/>
       </w:pPr>
       <w:r>
         <w:t>max_payload_bytes=24532</w:t>
@@ -891,7 +988,7 @@
     </w:p>
     <w:p>
       <w:r>
-        <w:t>Luu file:</w:t>
+        <w:t>Lưu file:</w:t>
       </w:r>
     </w:p>
     <w:p>
@@ -899,7 +996,7 @@
         <w:pStyle w:val="ListBullet"/>
       </w:pPr>
       <w:r>
-        <w:t>Nhan Ctrl+O</w:t>
+        <w:t>Nhấn Ctrl+O.</w:t>
       </w:r>
     </w:p>
     <w:p>
@@ -907,7 +1004,7 @@
         <w:pStyle w:val="ListBullet"/>
       </w:pPr>
       <w:r>
-        <w:t>Nhan Enter</w:t>
+        <w:t>Nhấn Enter.</w:t>
       </w:r>
     </w:p>
     <w:p>
@@ -915,17 +1012,17 @@
         <w:pStyle w:val="ListBullet"/>
       </w:pPr>
       <w:r>
-        <w:t>Nhan Ctrl+X</w:t>
+        <w:t>Nhấn Ctrl+X.</w:t>
       </w:r>
     </w:p>
     <w:p>
       <w:r>
-        <w:t>Kiem tra:</w:t>
+        <w:t>Kiểm tra:</w:t>
       </w:r>
     </w:p>
     <w:p>
       <w:pPr>
-        <w:pStyle w:val="Code"/>
+        <w:pStyle w:val="CodeBlock"/>
       </w:pPr>
       <w:r>
         <w:t>cat analysis.txt</w:t>
@@ -933,7 +1030,7 @@
     </w:p>
     <w:p>
       <w:r>
-        <w:t>Giai thich:</w:t>
+        <w:t>Giải thích:</w:t>
       </w:r>
     </w:p>
     <w:p>
@@ -941,7 +1038,7 @@
         <w:pStyle w:val="ListBullet"/>
       </w:pPr>
       <w:r>
-        <w:t>Anh cover.png co kich thuoc 256x256.</w:t>
+        <w:t>Ảnh cover.png có kích thước 256x256.</w:t>
       </w:r>
     </w:p>
     <w:p>
@@ -949,7 +1046,7 @@
         <w:pStyle w:val="ListBullet"/>
       </w:pPr>
       <w:r>
-        <w:t>Anh RGB co 3 kenh mau R, G, B.</w:t>
+        <w:t>Ảnh RGB có 3 kênh màu R, G, B.</w:t>
       </w:r>
     </w:p>
     <w:p>
@@ -957,7 +1054,7 @@
         <w:pStyle w:val="ListBullet"/>
       </w:pPr>
       <w:r>
-        <w:t>Moi kenh giau duoc 1 bit.</w:t>
+        <w:t>Mỗi kênh giấu được 1 bit.</w:t>
       </w:r>
     </w:p>
     <w:p>
@@ -994,12 +1091,12 @@
     </w:p>
     <w:p>
       <w:r>
-        <w:t>Chay:</w:t>
+        <w:t>Chạy:</w:t>
       </w:r>
     </w:p>
     <w:p>
       <w:pPr>
-        <w:pStyle w:val="Code"/>
+        <w:pStyle w:val="CodeBlock"/>
       </w:pPr>
       <w:r>
         <w:t>bash check_work.sh</w:t>
@@ -1007,12 +1104,12 @@
     </w:p>
     <w:p>
       <w:r>
-        <w:t>Ket qua dung:</w:t>
+        <w:t>Kết quả đúng:</w:t>
       </w:r>
     </w:p>
     <w:p>
       <w:pPr>
-        <w:pStyle w:val="Code"/>
+        <w:pStyle w:val="CodeBlock"/>
       </w:pPr>
       <w:r>
         <w:t>TASK1_ENCODE_IMAGE_PASS</w:t>
@@ -1020,7 +1117,7 @@
     </w:p>
     <w:p>
       <w:pPr>
-        <w:pStyle w:val="Code"/>
+        <w:pStyle w:val="CodeBlock"/>
       </w:pPr>
       <w:r>
         <w:t>TASK2_HEADER_DETECTED_PASS</w:t>
@@ -1028,7 +1125,7 @@
     </w:p>
     <w:p>
       <w:pPr>
-        <w:pStyle w:val="Code"/>
+        <w:pStyle w:val="CodeBlock"/>
       </w:pPr>
       <w:r>
         <w:t>TASK3_HASH_VALID_PASS</w:t>
@@ -1036,7 +1133,7 @@
     </w:p>
     <w:p>
       <w:pPr>
-        <w:pStyle w:val="Code"/>
+        <w:pStyle w:val="CodeBlock"/>
       </w:pPr>
       <w:r>
         <w:t>TASK4_RECOVERED_MATCH_PASS</w:t>
@@ -1044,7 +1141,7 @@
     </w:p>
     <w:p>
       <w:pPr>
-        <w:pStyle w:val="Code"/>
+        <w:pStyle w:val="CodeBlock"/>
       </w:pPr>
       <w:r>
         <w:t>TASK5_NEGATIVE_TEST_PASS</w:t>
@@ -1052,7 +1149,7 @@
     </w:p>
     <w:p>
       <w:pPr>
-        <w:pStyle w:val="Code"/>
+        <w:pStyle w:val="CodeBlock"/>
       </w:pPr>
       <w:r>
         <w:t>TASK6_CAPACITY_ANALYSIS_PASS</w:t>
@@ -1060,7 +1157,7 @@
     </w:p>
     <w:p>
       <w:pPr>
-        <w:pStyle w:val="Code"/>
+        <w:pStyle w:val="CodeBlock"/>
       </w:pPr>
       <w:r>
         <w:t>ALL_TASKS_PASS</w:t>
@@ -1068,28 +1165,12 @@
     </w:p>
     <w:p>
       <w:r>
-        <w:t>Neu van fail:</w:t>
+        <w:t>Nếu vẫn có task FAIL, hãy xem task nào bị lỗi và đọc log tương ứng:</w:t>
       </w:r>
     </w:p>
     <w:p>
       <w:pPr>
-        <w:pStyle w:val="ListBullet"/>
-      </w:pPr>
-      <w:r>
-        <w:t>Doc task nao FAIL.</w:t>
-      </w:r>
-    </w:p>
-    <w:p>
-      <w:pPr>
-        <w:pStyle w:val="ListBullet"/>
-      </w:pPr>
-      <w:r>
-        <w:t>Xem file log tuong ung:</w:t>
-      </w:r>
-    </w:p>
-    <w:p>
-      <w:pPr>
-        <w:pStyle w:val="Code"/>
+        <w:pStyle w:val="CodeBlock"/>
       </w:pPr>
       <w:r>
         <w:t>cat encode.log</w:t>
@@ -1097,7 +1178,7 @@
     </w:p>
     <w:p>
       <w:pPr>
-        <w:pStyle w:val="Code"/>
+        <w:pStyle w:val="CodeBlock"/>
       </w:pPr>
       <w:r>
         <w:t>cat decode.log</w:t>
@@ -1105,7 +1186,7 @@
     </w:p>
     <w:p>
       <w:pPr>
-        <w:pStyle w:val="Code"/>
+        <w:pStyle w:val="CodeBlock"/>
       </w:pPr>
       <w:r>
         <w:t>cat no_header.log</w:t>
@@ -1113,12 +1194,12 @@
     </w:p>
     <w:p>
       <w:r>
-        <w:t>Chay:</w:t>
+        <w:t>Chạy:</w:t>
       </w:r>
     </w:p>
     <w:p>
       <w:pPr>
-        <w:pStyle w:val="Code"/>
+        <w:pStyle w:val="CodeBlock"/>
       </w:pPr>
       <w:r>
         <w:t>checkwork lsb-secret-header</w:t>
@@ -1126,12 +1207,12 @@
     </w:p>
     <w:p>
       <w:r>
-        <w:t>Ket qua dung:</w:t>
+        <w:t>Kết quả đúng:</w:t>
       </w:r>
     </w:p>
     <w:p>
       <w:pPr>
-        <w:pStyle w:val="Code"/>
+        <w:pStyle w:val="CodeBlock"/>
       </w:pPr>
       <w:r>
         <w:t>Y - Task_1_Encode_image</w:t>
@@ -1139,7 +1220,7 @@
     </w:p>
     <w:p>
       <w:pPr>
-        <w:pStyle w:val="Code"/>
+        <w:pStyle w:val="CodeBlock"/>
       </w:pPr>
       <w:r>
         <w:t>Y - Task_2_Detect_secret_header</w:t>
@@ -1147,7 +1228,7 @@
     </w:p>
     <w:p>
       <w:pPr>
-        <w:pStyle w:val="Code"/>
+        <w:pStyle w:val="CodeBlock"/>
       </w:pPr>
       <w:r>
         <w:t>Y - Task_3_Verify_SHA256</w:t>
@@ -1155,7 +1236,7 @@
     </w:p>
     <w:p>
       <w:pPr>
-        <w:pStyle w:val="Code"/>
+        <w:pStyle w:val="CodeBlock"/>
       </w:pPr>
       <w:r>
         <w:t>Y - Task_4_Recover_original_message</w:t>
@@ -1163,7 +1244,7 @@
     </w:p>
     <w:p>
       <w:pPr>
-        <w:pStyle w:val="Code"/>
+        <w:pStyle w:val="CodeBlock"/>
       </w:pPr>
       <w:r>
         <w:t>Y - Task_5_Detect_image_without_secret</w:t>
@@ -1171,7 +1252,7 @@
     </w:p>
     <w:p>
       <w:pPr>
-        <w:pStyle w:val="Code"/>
+        <w:pStyle w:val="CodeBlock"/>
       </w:pPr>
       <w:r>
         <w:t>Y - Task_6_Calculate_capacity</w:t>
@@ -1179,7 +1260,7 @@
     </w:p>
     <w:p>
       <w:pPr>
-        <w:pStyle w:val="Code"/>
+        <w:pStyle w:val="CodeBlock"/>
       </w:pPr>
       <w:r>
         <w:t>Y - All_tasks_completed</w:t>
@@ -1187,12 +1268,12 @@
     </w:p>
     <w:p>
       <w:r>
-        <w:t>Sau khi checkwork da pass, chay:</w:t>
+        <w:t>Sau khi checkwork đã pass, chạy:</w:t>
       </w:r>
     </w:p>
     <w:p>
       <w:pPr>
-        <w:pStyle w:val="Code"/>
+        <w:pStyle w:val="CodeBlock"/>
       </w:pPr>
       <w:r>
         <w:t>stoplab lsb-secret-header</w:t>
@@ -1200,20 +1281,26 @@
     </w:p>
     <w:p>
       <w:r>
-        <w:t>File nop bai nam trong:</w:t>
+        <w:t>File nộp bài nằm trong:</w:t>
       </w:r>
     </w:p>
     <w:p>
+      <w:pPr>
+        <w:pStyle w:val="CodeBlock"/>
+      </w:pPr>
       <w:r>
         <w:t>~/labtainer_xfer/lsb-secret-header</w:t>
       </w:r>
     </w:p>
     <w:p>
       <w:r>
-        <w:t>File can nop co dang:</w:t>
+        <w:t>File cần nộp có dạng:</w:t>
       </w:r>
     </w:p>
     <w:p>
+      <w:pPr>
+        <w:pStyle w:val="CodeBlock"/>
+      </w:pPr>
       <w:r>
         <w:t>&lt;student_id&gt;.lsb-secret-header.lab</w:t>
       </w:r>
@@ -1223,12 +1310,12 @@
         <w:pStyle w:val="ListNumber"/>
       </w:pPr>
       <w:r>
-        <w:t>Khong thay encoded.png</w:t>
+        <w:t>Không thấy encoded.png</w:t>
       </w:r>
     </w:p>
     <w:p>
       <w:r>
-        <w:t xml:space="preserve">   Binh thuong neu ban chua chay:</w:t>
+        <w:t xml:space="preserve">   Điều này bình thường nếu bạn chưa chạy:</w:t>
       </w:r>
     </w:p>
     <w:p>
@@ -1241,12 +1328,12 @@
         <w:pStyle w:val="ListNumber"/>
       </w:pPr>
       <w:r>
-        <w:t>Khong thay recovered.txt</w:t>
+        <w:t>Không thấy recovered.txt</w:t>
       </w:r>
     </w:p>
     <w:p>
       <w:r>
-        <w:t xml:space="preserve">   Binh thuong neu ban chua chay:</w:t>
+        <w:t xml:space="preserve">   Điều này bình thường nếu bạn chưa chạy:</w:t>
       </w:r>
     </w:p>
     <w:p>
@@ -1259,12 +1346,12 @@
         <w:pStyle w:val="ListNumber"/>
       </w:pPr>
       <w:r>
-        <w:t>encode.py bao NotImplementedError</w:t>
+        <w:t>encode.py báo NotImplementedError</w:t>
       </w:r>
     </w:p>
     <w:p>
       <w:r>
-        <w:t xml:space="preserve">   Ban chua thay het cac ham TODO trong encode.py.</w:t>
+        <w:t xml:space="preserve">   Bạn chưa thay hết các hàm TODO trong encode.py.</w:t>
       </w:r>
     </w:p>
     <w:p>
@@ -1272,12 +1359,12 @@
         <w:pStyle w:val="ListNumber"/>
       </w:pPr>
       <w:r>
-        <w:t>decode.py bao NotImplementedError</w:t>
+        <w:t>decode.py báo NotImplementedError</w:t>
       </w:r>
     </w:p>
     <w:p>
       <w:r>
-        <w:t xml:space="preserve">   Ban chua thay het cac ham TODO trong decode.py.</w:t>
+        <w:t xml:space="preserve">   Bạn chưa thay hết các hàm TODO trong decode.py.</w:t>
       </w:r>
     </w:p>
     <w:p>
@@ -1285,12 +1372,12 @@
         <w:pStyle w:val="ListNumber"/>
       </w:pPr>
       <w:r>
-        <w:t>HEADER fail</w:t>
+        <w:t>Header bị fail</w:t>
       </w:r>
     </w:p>
     <w:p>
       <w:r>
-        <w:t xml:space="preserve">   Co the do encode sai thu tu bit. Khi tach byte thanh bit phai di tu bit 7 ve bit 0.</w:t>
+        <w:t xml:space="preserve">   Có thể do encode sai thứ tự bit. Khi tách byte thành bit phải đi từ bit 7 về bit 0.</w:t>
       </w:r>
     </w:p>
     <w:p>
@@ -1298,12 +1385,12 @@
         <w:pStyle w:val="ListNumber"/>
       </w:pPr>
       <w:r>
-        <w:t>SHA256 fail</w:t>
+        <w:t>SHA-256 bị fail</w:t>
       </w:r>
     </w:p>
     <w:p>
       <w:r>
-        <w:t xml:space="preserve">   Co the do doc sai LENGTH, sai endian, hoac ghep byte sai thu tu bit.</w:t>
+        <w:t xml:space="preserve">   Có thể do đọc sai LENGTH, sai endian hoặc ghép byte sai thứ tự bit.</w:t>
       </w:r>
     </w:p>
     <w:p>
@@ -1311,12 +1398,12 @@
         <w:pStyle w:val="ListNumber"/>
       </w:pPr>
       <w:r>
-        <w:t>Negative test fail</w:t>
+        <w:t>Negative test bị fail</w:t>
       </w:r>
     </w:p>
     <w:p>
       <w:r>
-        <w:t xml:space="preserve">   Khi magic != MAGIC, phai print NO_SECRET_HEADER va thoat ngay.</w:t>
+        <w:t xml:space="preserve">   Khi magic != MAGIC, phải in NO_SECRET_HEADER và thoát ngay.</w:t>
       </w:r>
     </w:p>
     <w:p>
@@ -1324,12 +1411,12 @@
         <w:pStyle w:val="ListNumber"/>
       </w:pPr>
       <w:r>
-        <w:t>Task 6 fail</w:t>
+        <w:t>Task 6 bị fail</w:t>
       </w:r>
     </w:p>
     <w:p>
       <w:r>
-        <w:t xml:space="preserve">   Kiem tra analysis.txt co dung ten file, dung 4 dong, dung gia tri va khong viet sai key.</w:t>
+        <w:t xml:space="preserve">   Kiểm tra analysis.txt có đúng tên file, đúng 4 dòng, đúng giá trị và không viết sai key.</w:t>
       </w:r>
     </w:p>
     <w:p>
@@ -1337,7 +1424,7 @@
         <w:pStyle w:val="ListNumber"/>
       </w:pPr>
       <w:r>
-        <w:t>Ky thuat LSB la gi?</w:t>
+        <w:t>Kỹ thuật LSB là gì?</w:t>
       </w:r>
     </w:p>
     <w:p>
@@ -1345,7 +1432,7 @@
         <w:pStyle w:val="ListNumber"/>
       </w:pPr>
       <w:r>
-        <w:t>Vi sao anh sau khi giau tin nhin gan giong anh goc?</w:t>
+        <w:t>Vì sao ảnh sau khi giấu tin nhìn gần giống ảnh gốc?</w:t>
       </w:r>
     </w:p>
     <w:p>
@@ -1353,7 +1440,7 @@
         <w:pStyle w:val="ListNumber"/>
       </w:pPr>
       <w:r>
-        <w:t>Header PTITLSB1 dung de lam gi?</w:t>
+        <w:t>Header PTITLSB1 dùng để làm gì?</w:t>
       </w:r>
     </w:p>
     <w:p>
@@ -1361,7 +1448,7 @@
         <w:pStyle w:val="ListNumber"/>
       </w:pPr>
       <w:r>
-        <w:t>Vi sao can truong LENGTH?</w:t>
+        <w:t>Vì sao cần trường LENGTH?</w:t>
       </w:r>
     </w:p>
     <w:p>
@@ -1369,7 +1456,7 @@
         <w:pStyle w:val="ListNumber"/>
       </w:pPr>
       <w:r>
-        <w:t>SHA-256 trong bai lab co tac dung gi?</w:t>
+        <w:t>SHA-256 trong bài lab có tác dụng gì?</w:t>
       </w:r>
     </w:p>
     <w:p>
@@ -1377,7 +1464,7 @@
         <w:pStyle w:val="ListNumber"/>
       </w:pPr>
       <w:r>
-        <w:t>Cong thuc tinh dung luong giau tin toi da cua anh RGB la gi?</w:t>
+        <w:t>Công thức tính dung lượng giấu tin tối đa của ảnh RGB là gì?</w:t>
       </w:r>
     </w:p>
     <w:p>
@@ -1385,7 +1472,7 @@
         <w:pStyle w:val="ListNumber"/>
       </w:pPr>
       <w:r>
-        <w:t>Anh 256x256 RGB giau duoc toi da bao nhieu byte payload?</w:t>
+        <w:t>Ảnh 256x256 RGB giấu được tối đa bao nhiêu byte payload?</w:t>
       </w:r>
     </w:p>
     <w:p>
@@ -1393,7 +1480,7 @@
         <w:pStyle w:val="ListNumber"/>
       </w:pPr>
       <w:r>
-        <w:t>Ky thuat LSB co an toan tuyet doi khong? Vi sao?</w:t>
+        <w:t>Kỹ thuật LSB có an toàn tuyệt đối không? Vì sao?</w:t>
       </w:r>
     </w:p>
     <w:sectPr>
@@ -1415,7 +1502,7 @@
       <w:jc w:val="right"/>
     </w:pPr>
     <w:r>
-      <w:t>lsb-secret-header step-by-step guide</w:t>
+      <w:t>lsb-secret-header - hướng dẫn từng bước</w:t>
     </w:r>
   </w:p>
 </w:ftr>
@@ -1871,15 +1958,15 @@
     <w:pPr>
       <w:keepNext/>
       <w:keepLines/>
-      <w:spacing w:before="240" w:after="120"/>
+      <w:spacing w:before="200" w:after="0"/>
       <w:outlineLvl w:val="1"/>
     </w:pPr>
     <w:rPr>
-      <w:rFonts w:asciiTheme="majorHAnsi" w:eastAsiaTheme="majorEastAsia" w:hAnsiTheme="majorHAnsi" w:cstheme="majorBidi" w:ascii="Calibri" w:hAnsi="Calibri"/>
+      <w:rFonts w:asciiTheme="majorHAnsi" w:eastAsiaTheme="majorEastAsia" w:hAnsiTheme="majorHAnsi" w:cstheme="majorBidi"/>
       <w:b/>
       <w:bCs/>
-      <w:color w:val="1F4D78"/>
-      <w:sz w:val="24"/>
+      <w:color w:val="4F81BD" w:themeColor="accent1"/>
+      <w:sz w:val="26"/>
       <w:szCs w:val="26"/>
     </w:rPr>
   </w:style>
@@ -13475,11 +13562,11 @@
       </w:tcPr>
     </w:tblStylePr>
   </w:style>
-  <w:style w:type="paragraph" w:customStyle="1" w:styleId="Code">
-    <w:name w:val="Code"/>
+  <w:style w:type="paragraph" w:customStyle="1" w:styleId="CodeBlock">
+    <w:name w:val="CodeBlock"/>
     <w:pPr>
       <w:spacing w:after="0"/>
-      <w:ind w:left="259"/>
+      <w:ind w:left="288"/>
     </w:pPr>
     <w:rPr>
       <w:rFonts w:ascii="Consolas" w:hAnsi="Consolas"/>

</xml_diff>

<commit_message>
Format guide code blocks for copying
</commit_message>
<xml_diff>
--- a/docs/lsb-secret-header-word-guide.docx
+++ b/docs/lsb-secret-header-word-guide.docx
@@ -76,6 +76,7 @@
     <w:p>
       <w:pPr>
         <w:pStyle w:val="CodeBlock"/>
+        <w:shd w:fill="F4F6F9"/>
       </w:pPr>
       <w:r>
         <w:t>https://github.com/vuxvinh/KiThuatGiauTin/raw/main/lsb-secret-header.tar</w:t>
@@ -89,6 +90,7 @@
     <w:p>
       <w:pPr>
         <w:pStyle w:val="CodeBlock"/>
+        <w:shd w:fill="F4F6F9"/>
       </w:pPr>
       <w:r>
         <w:t>imodule https://github.com/vuxvinh/KiThuatGiauTin/raw/main/lsb-secret-header.tar</w:t>
@@ -102,6 +104,7 @@
     <w:p>
       <w:pPr>
         <w:pStyle w:val="CodeBlock"/>
+        <w:shd w:fill="F4F6F9"/>
       </w:pPr>
       <w:r>
         <w:t>labtainer lsb-secret-header</w:t>
@@ -115,6 +118,7 @@
     <w:p>
       <w:pPr>
         <w:pStyle w:val="CodeBlock"/>
+        <w:shd w:fill="F4F6F9"/>
       </w:pPr>
       <w:r>
         <w:t>labtainer -r lsb-secret-header</w:t>
@@ -128,6 +132,7 @@
     <w:p>
       <w:pPr>
         <w:pStyle w:val="CodeBlock"/>
+        <w:shd w:fill="F4F6F9"/>
       </w:pPr>
       <w:r>
         <w:t>ls</w:t>
@@ -141,6 +146,7 @@
     <w:p>
       <w:pPr>
         <w:pStyle w:val="CodeBlock"/>
+        <w:shd w:fill="F4F6F9"/>
       </w:pPr>
       <w:r>
         <w:t>README.md</w:t>
@@ -149,6 +155,7 @@
     <w:p>
       <w:pPr>
         <w:pStyle w:val="CodeBlock"/>
+        <w:shd w:fill="F4F6F9"/>
       </w:pPr>
       <w:r>
         <w:t>cover.png</w:t>
@@ -157,6 +164,7 @@
     <w:p>
       <w:pPr>
         <w:pStyle w:val="CodeBlock"/>
+        <w:shd w:fill="F4F6F9"/>
       </w:pPr>
       <w:r>
         <w:t>no_secret.png</w:t>
@@ -165,6 +173,7 @@
     <w:p>
       <w:pPr>
         <w:pStyle w:val="CodeBlock"/>
+        <w:shd w:fill="F4F6F9"/>
       </w:pPr>
       <w:r>
         <w:t>secret.txt</w:t>
@@ -173,6 +182,7 @@
     <w:p>
       <w:pPr>
         <w:pStyle w:val="CodeBlock"/>
+        <w:shd w:fill="F4F6F9"/>
       </w:pPr>
       <w:r>
         <w:t>encode.py</w:t>
@@ -181,6 +191,7 @@
     <w:p>
       <w:pPr>
         <w:pStyle w:val="CodeBlock"/>
+        <w:shd w:fill="F4F6F9"/>
       </w:pPr>
       <w:r>
         <w:t>decode.py</w:t>
@@ -189,6 +200,7 @@
     <w:p>
       <w:pPr>
         <w:pStyle w:val="CodeBlock"/>
+        <w:shd w:fill="F4F6F9"/>
       </w:pPr>
       <w:r>
         <w:t>check_work.sh</w:t>
@@ -197,6 +209,7 @@
     <w:p>
       <w:pPr>
         <w:pStyle w:val="CodeBlock"/>
+        <w:shd w:fill="F4F6F9"/>
       </w:pPr>
       <w:r>
         <w:t>make_assets.py</w:t>
@@ -215,6 +228,7 @@
     <w:p>
       <w:pPr>
         <w:pStyle w:val="CodeBlock"/>
+        <w:shd w:fill="F4F6F9"/>
       </w:pPr>
       <w:r>
         <w:t>bash check_work.sh</w:t>
@@ -262,6 +276,7 @@
     <w:p>
       <w:pPr>
         <w:pStyle w:val="CodeBlock"/>
+        <w:shd w:fill="F4F6F9"/>
       </w:pPr>
       <w:r>
         <w:t>nano encode.py</w:t>
@@ -275,6 +290,7 @@
     <w:p>
       <w:pPr>
         <w:pStyle w:val="CodeBlock"/>
+        <w:shd w:fill="F4F6F9"/>
       </w:pPr>
       <w:r>
         <w:t>def build_packet(payload: bytes) -&gt; bytes:</w:t>
@@ -283,6 +299,7 @@
     <w:p>
       <w:pPr>
         <w:pStyle w:val="CodeBlock"/>
+        <w:shd w:fill="F4F6F9"/>
       </w:pPr>
       <w:r>
         <w:t xml:space="preserve">    length_bytes = struct.pack("&gt;I", len(payload))</w:t>
@@ -291,6 +308,7 @@
     <w:p>
       <w:pPr>
         <w:pStyle w:val="CodeBlock"/>
+        <w:shd w:fill="F4F6F9"/>
       </w:pPr>
       <w:r>
         <w:t xml:space="preserve">    digest = hashlib.sha256(payload).digest()</w:t>
@@ -299,6 +317,7 @@
     <w:p>
       <w:pPr>
         <w:pStyle w:val="CodeBlock"/>
+        <w:shd w:fill="F4F6F9"/>
       </w:pPr>
       <w:r>
         <w:t xml:space="preserve">    return MAGIC + length_bytes + digest + payload</w:t>
@@ -312,6 +331,7 @@
     <w:p>
       <w:pPr>
         <w:pStyle w:val="CodeBlock"/>
+        <w:shd w:fill="F4F6F9"/>
       </w:pPr>
       <w:r>
         <w:t>def capacity_bits(img: Image.Image) -&gt; int:</w:t>
@@ -320,6 +340,7 @@
     <w:p>
       <w:pPr>
         <w:pStyle w:val="CodeBlock"/>
+        <w:shd w:fill="F4F6F9"/>
       </w:pPr>
       <w:r>
         <w:t xml:space="preserve">    return img.width * img.height * 3</w:t>
@@ -333,6 +354,7 @@
     <w:p>
       <w:pPr>
         <w:pStyle w:val="CodeBlock"/>
+        <w:shd w:fill="F4F6F9"/>
       </w:pPr>
       <w:r>
         <w:t>def embed_packet(img: Image.Image, packet: bytes) -&gt; Image.Image:</w:t>
@@ -341,6 +363,7 @@
     <w:p>
       <w:pPr>
         <w:pStyle w:val="CodeBlock"/>
+        <w:shd w:fill="F4F6F9"/>
       </w:pPr>
       <w:r>
         <w:t xml:space="preserve">    img = img.convert("RGB")</w:t>
@@ -349,6 +372,7 @@
     <w:p>
       <w:pPr>
         <w:pStyle w:val="CodeBlock"/>
+        <w:shd w:fill="F4F6F9"/>
       </w:pPr>
       <w:r>
         <w:t xml:space="preserve">    pixels = list(img.getdata())</w:t>
@@ -357,14 +381,16 @@
     <w:p>
       <w:pPr>
         <w:pStyle w:val="CodeBlock"/>
+        <w:shd w:fill="F4F6F9"/>
       </w:pPr>
       <w:r>
-        <w:t>channels = []</w:t>
+        <w:t xml:space="preserve">    channels = []</w:t>
       </w:r>
     </w:p>
     <w:p>
       <w:pPr>
         <w:pStyle w:val="CodeBlock"/>
+        <w:shd w:fill="F4F6F9"/>
       </w:pPr>
       <w:r>
         <w:t xml:space="preserve">    for r, g, b in pixels:</w:t>
@@ -373,27 +399,34 @@
     <w:p>
       <w:pPr>
         <w:pStyle w:val="CodeBlock"/>
+        <w:shd w:fill="F4F6F9"/>
       </w:pPr>
       <w:r>
         <w:t xml:space="preserve">        channels.extend([r, g, b])</w:t>
       </w:r>
     </w:p>
     <w:p>
+      <w:pPr>
+        <w:pStyle w:val="CodeBlock"/>
+        <w:shd w:fill="F4F6F9"/>
+      </w:pPr>
       <w:r>
-        <w:t>bits = list(bytes_to_bits(packet))</w:t>
+        <w:t xml:space="preserve">    bits = list(bytes_to_bits(packet))</w:t>
       </w:r>
     </w:p>
     <w:p>
       <w:pPr>
         <w:pStyle w:val="CodeBlock"/>
+        <w:shd w:fill="F4F6F9"/>
       </w:pPr>
       <w:r>
-        <w:t>if len(bits) &gt; len(channels):</w:t>
+        <w:t xml:space="preserve">    if len(bits) &gt; len(channels):</w:t>
       </w:r>
     </w:p>
     <w:p>
       <w:pPr>
         <w:pStyle w:val="CodeBlock"/>
+        <w:shd w:fill="F4F6F9"/>
       </w:pPr>
       <w:r>
         <w:t xml:space="preserve">        raise ValueError("Packet is too large for this image")</w:t>
@@ -402,14 +435,16 @@
     <w:p>
       <w:pPr>
         <w:pStyle w:val="CodeBlock"/>
+        <w:shd w:fill="F4F6F9"/>
       </w:pPr>
       <w:r>
-        <w:t>for i, bit in enumerate(bits):</w:t>
+        <w:t xml:space="preserve">    for i, bit in enumerate(bits):</w:t>
       </w:r>
     </w:p>
     <w:p>
       <w:pPr>
         <w:pStyle w:val="CodeBlock"/>
+        <w:shd w:fill="F4F6F9"/>
       </w:pPr>
       <w:r>
         <w:t xml:space="preserve">        channels[i] = (channels[i] &amp; 0xFE) | bit</w:t>
@@ -418,14 +453,16 @@
     <w:p>
       <w:pPr>
         <w:pStyle w:val="CodeBlock"/>
+        <w:shd w:fill="F4F6F9"/>
       </w:pPr>
       <w:r>
-        <w:t>new_pixels = []</w:t>
+        <w:t xml:space="preserve">    new_pixels = []</w:t>
       </w:r>
     </w:p>
     <w:p>
       <w:pPr>
         <w:pStyle w:val="CodeBlock"/>
+        <w:shd w:fill="F4F6F9"/>
       </w:pPr>
       <w:r>
         <w:t xml:space="preserve">    for i in range(0, len(channels), 3):</w:t>
@@ -434,6 +471,7 @@
     <w:p>
       <w:pPr>
         <w:pStyle w:val="CodeBlock"/>
+        <w:shd w:fill="F4F6F9"/>
       </w:pPr>
       <w:r>
         <w:t xml:space="preserve">        new_pixels.append((channels[i], channels[i + 1], channels[i + 2]))</w:t>
@@ -442,14 +480,16 @@
     <w:p>
       <w:pPr>
         <w:pStyle w:val="CodeBlock"/>
+        <w:shd w:fill="F4F6F9"/>
       </w:pPr>
       <w:r>
-        <w:t>out = Image.new("RGB", img.size)</w:t>
+        <w:t xml:space="preserve">    out = Image.new("RGB", img.size)</w:t>
       </w:r>
     </w:p>
     <w:p>
       <w:pPr>
         <w:pStyle w:val="CodeBlock"/>
+        <w:shd w:fill="F4F6F9"/>
       </w:pPr>
       <w:r>
         <w:t xml:space="preserve">    out.putdata(new_pixels)</w:t>
@@ -458,6 +498,7 @@
     <w:p>
       <w:pPr>
         <w:pStyle w:val="CodeBlock"/>
+        <w:shd w:fill="F4F6F9"/>
       </w:pPr>
       <w:r>
         <w:t xml:space="preserve">    return out</w:t>
@@ -500,6 +541,7 @@
     <w:p>
       <w:pPr>
         <w:pStyle w:val="CodeBlock"/>
+        <w:shd w:fill="F4F6F9"/>
       </w:pPr>
       <w:r>
         <w:t>python3 encode.py cover.png secret.txt encoded.png</w:t>
@@ -518,6 +560,7 @@
     <w:p>
       <w:pPr>
         <w:pStyle w:val="CodeBlock"/>
+        <w:shd w:fill="F4F6F9"/>
       </w:pPr>
       <w:r>
         <w:t>ls -l encoded.png</w:t>
@@ -531,6 +574,7 @@
     <w:p>
       <w:pPr>
         <w:pStyle w:val="CodeBlock"/>
+        <w:shd w:fill="F4F6F9"/>
       </w:pPr>
       <w:r>
         <w:t>nano decode.py</w:t>
@@ -544,6 +588,7 @@
     <w:p>
       <w:pPr>
         <w:pStyle w:val="CodeBlock"/>
+        <w:shd w:fill="F4F6F9"/>
       </w:pPr>
       <w:r>
         <w:t>def image_lsb_bits(img: Image.Image):</w:t>
@@ -552,6 +597,7 @@
     <w:p>
       <w:pPr>
         <w:pStyle w:val="CodeBlock"/>
+        <w:shd w:fill="F4F6F9"/>
       </w:pPr>
       <w:r>
         <w:t xml:space="preserve">    img = img.convert("RGB")</w:t>
@@ -560,6 +606,7 @@
     <w:p>
       <w:pPr>
         <w:pStyle w:val="CodeBlock"/>
+        <w:shd w:fill="F4F6F9"/>
       </w:pPr>
       <w:r>
         <w:t xml:space="preserve">    for r, g, b in img.getdata():</w:t>
@@ -568,6 +615,7 @@
     <w:p>
       <w:pPr>
         <w:pStyle w:val="CodeBlock"/>
+        <w:shd w:fill="F4F6F9"/>
       </w:pPr>
       <w:r>
         <w:t xml:space="preserve">        yield r &amp; 1</w:t>
@@ -576,6 +624,7 @@
     <w:p>
       <w:pPr>
         <w:pStyle w:val="CodeBlock"/>
+        <w:shd w:fill="F4F6F9"/>
       </w:pPr>
       <w:r>
         <w:t xml:space="preserve">        yield g &amp; 1</w:t>
@@ -584,6 +633,7 @@
     <w:p>
       <w:pPr>
         <w:pStyle w:val="CodeBlock"/>
+        <w:shd w:fill="F4F6F9"/>
       </w:pPr>
       <w:r>
         <w:t xml:space="preserve">        yield b &amp; 1</w:t>
@@ -597,6 +647,7 @@
     <w:p>
       <w:pPr>
         <w:pStyle w:val="CodeBlock"/>
+        <w:shd w:fill="F4F6F9"/>
       </w:pPr>
       <w:r>
         <w:t>def bits_to_bytes(bits):</w:t>
@@ -605,6 +656,7 @@
     <w:p>
       <w:pPr>
         <w:pStyle w:val="CodeBlock"/>
+        <w:shd w:fill="F4F6F9"/>
       </w:pPr>
       <w:r>
         <w:t xml:space="preserve">    data = bytearray()</w:t>
@@ -613,14 +665,16 @@
     <w:p>
       <w:pPr>
         <w:pStyle w:val="CodeBlock"/>
+        <w:shd w:fill="F4F6F9"/>
       </w:pPr>
       <w:r>
-        <w:t>for i in range(0, len(bits), 8):</w:t>
+        <w:t xml:space="preserve">    for i in range(0, len(bits), 8):</w:t>
       </w:r>
     </w:p>
     <w:p>
       <w:pPr>
         <w:pStyle w:val="CodeBlock"/>
+        <w:shd w:fill="F4F6F9"/>
       </w:pPr>
       <w:r>
         <w:t xml:space="preserve">        chunk = bits[i:i + 8]</w:t>
@@ -629,14 +683,16 @@
     <w:p>
       <w:pPr>
         <w:pStyle w:val="CodeBlock"/>
+        <w:shd w:fill="F4F6F9"/>
       </w:pPr>
       <w:r>
-        <w:t>if len(chunk) &lt; 8:</w:t>
+        <w:t xml:space="preserve">        if len(chunk) &lt; 8:</w:t>
       </w:r>
     </w:p>
     <w:p>
       <w:pPr>
         <w:pStyle w:val="CodeBlock"/>
+        <w:shd w:fill="F4F6F9"/>
       </w:pPr>
       <w:r>
         <w:t xml:space="preserve">            break</w:t>
@@ -645,14 +701,16 @@
     <w:p>
       <w:pPr>
         <w:pStyle w:val="CodeBlock"/>
+        <w:shd w:fill="F4F6F9"/>
       </w:pPr>
       <w:r>
-        <w:t>value = 0</w:t>
+        <w:t xml:space="preserve">        value = 0</w:t>
       </w:r>
     </w:p>
     <w:p>
       <w:pPr>
         <w:pStyle w:val="CodeBlock"/>
+        <w:shd w:fill="F4F6F9"/>
       </w:pPr>
       <w:r>
         <w:t xml:space="preserve">        for bit in chunk:</w:t>
@@ -661,19 +719,28 @@
     <w:p>
       <w:pPr>
         <w:pStyle w:val="CodeBlock"/>
+        <w:shd w:fill="F4F6F9"/>
       </w:pPr>
       <w:r>
         <w:t xml:space="preserve">            value = (value &lt;&lt; 1) | bit</w:t>
       </w:r>
     </w:p>
     <w:p>
+      <w:pPr>
+        <w:pStyle w:val="CodeBlock"/>
+        <w:shd w:fill="F4F6F9"/>
+      </w:pPr>
       <w:r>
-        <w:t>data.append(value)</w:t>
+        <w:t xml:space="preserve">        data.append(value)</w:t>
       </w:r>
     </w:p>
     <w:p>
+      <w:pPr>
+        <w:pStyle w:val="CodeBlock"/>
+        <w:shd w:fill="F4F6F9"/>
+      </w:pPr>
       <w:r>
-        <w:t>return bytes(data)</w:t>
+        <w:t xml:space="preserve">    return bytes(data)</w:t>
       </w:r>
     </w:p>
     <w:p>
@@ -684,6 +751,7 @@
     <w:p>
       <w:pPr>
         <w:pStyle w:val="CodeBlock"/>
+        <w:shd w:fill="F4F6F9"/>
       </w:pPr>
       <w:r>
         <w:t>def read_bytes_from_lsb(img: Image.Image, nbytes: int) -&gt; bytes:</w:t>
@@ -692,6 +760,7 @@
     <w:p>
       <w:pPr>
         <w:pStyle w:val="CodeBlock"/>
+        <w:shd w:fill="F4F6F9"/>
       </w:pPr>
       <w:r>
         <w:t xml:space="preserve">    need_bits = nbytes * 8</w:t>
@@ -700,6 +769,7 @@
     <w:p>
       <w:pPr>
         <w:pStyle w:val="CodeBlock"/>
+        <w:shd w:fill="F4F6F9"/>
       </w:pPr>
       <w:r>
         <w:t xml:space="preserve">    bits = []</w:t>
@@ -708,14 +778,16 @@
     <w:p>
       <w:pPr>
         <w:pStyle w:val="CodeBlock"/>
+        <w:shd w:fill="F4F6F9"/>
       </w:pPr>
       <w:r>
-        <w:t>for bit in image_lsb_bits(img):</w:t>
+        <w:t xml:space="preserve">    for bit in image_lsb_bits(img):</w:t>
       </w:r>
     </w:p>
     <w:p>
       <w:pPr>
         <w:pStyle w:val="CodeBlock"/>
+        <w:shd w:fill="F4F6F9"/>
       </w:pPr>
       <w:r>
         <w:t xml:space="preserve">        bits.append(bit)</w:t>
@@ -724,14 +796,16 @@
     <w:p>
       <w:pPr>
         <w:pStyle w:val="CodeBlock"/>
+        <w:shd w:fill="F4F6F9"/>
       </w:pPr>
       <w:r>
-        <w:t>if len(bits) == need_bits:</w:t>
+        <w:t xml:space="preserve">        if len(bits) == need_bits:</w:t>
       </w:r>
     </w:p>
     <w:p>
       <w:pPr>
         <w:pStyle w:val="CodeBlock"/>
+        <w:shd w:fill="F4F6F9"/>
       </w:pPr>
       <w:r>
         <w:t xml:space="preserve">            break</w:t>
@@ -740,22 +814,28 @@
     <w:p>
       <w:pPr>
         <w:pStyle w:val="CodeBlock"/>
+        <w:shd w:fill="F4F6F9"/>
       </w:pPr>
       <w:r>
-        <w:t>if len(bits) &lt; need_bits:</w:t>
+        <w:t xml:space="preserve">    if len(bits) &lt; need_bits:</w:t>
       </w:r>
     </w:p>
     <w:p>
       <w:pPr>
         <w:pStyle w:val="CodeBlock"/>
+        <w:shd w:fill="F4F6F9"/>
       </w:pPr>
       <w:r>
         <w:t xml:space="preserve">        raise ValueError("Image does not contain enough LSB bits")</w:t>
       </w:r>
     </w:p>
     <w:p>
+      <w:pPr>
+        <w:pStyle w:val="CodeBlock"/>
+        <w:shd w:fill="F4F6F9"/>
+      </w:pPr>
       <w:r>
-        <w:t>return bits_to_bytes(bits)</w:t>
+        <w:t xml:space="preserve">    return bits_to_bytes(bits)</w:t>
       </w:r>
     </w:p>
     <w:p>
@@ -795,6 +875,7 @@
     <w:p>
       <w:pPr>
         <w:pStyle w:val="CodeBlock"/>
+        <w:shd w:fill="F4F6F9"/>
       </w:pPr>
       <w:r>
         <w:t>python3 decode.py encoded.png recovered.txt</w:t>
@@ -808,6 +889,7 @@
     <w:p>
       <w:pPr>
         <w:pStyle w:val="CodeBlock"/>
+        <w:shd w:fill="F4F6F9"/>
       </w:pPr>
       <w:r>
         <w:t>HEADER_OK</w:t>
@@ -816,6 +898,7 @@
     <w:p>
       <w:pPr>
         <w:pStyle w:val="CodeBlock"/>
+        <w:shd w:fill="F4F6F9"/>
       </w:pPr>
       <w:r>
         <w:t>SHA256_OK</w:t>
@@ -824,6 +907,7 @@
     <w:p>
       <w:pPr>
         <w:pStyle w:val="CodeBlock"/>
+        <w:shd w:fill="F4F6F9"/>
       </w:pPr>
       <w:r>
         <w:t>DECODE_OK</w:t>
@@ -842,6 +926,7 @@
     <w:p>
       <w:pPr>
         <w:pStyle w:val="CodeBlock"/>
+        <w:shd w:fill="F4F6F9"/>
       </w:pPr>
       <w:r>
         <w:t>ls -l recovered.txt</w:t>
@@ -850,6 +935,7 @@
     <w:p>
       <w:pPr>
         <w:pStyle w:val="CodeBlock"/>
+        <w:shd w:fill="F4F6F9"/>
       </w:pPr>
       <w:r>
         <w:t>cat recovered.txt</w:t>
@@ -863,6 +949,7 @@
     <w:p>
       <w:pPr>
         <w:pStyle w:val="CodeBlock"/>
+        <w:shd w:fill="F4F6F9"/>
       </w:pPr>
       <w:r>
         <w:t>cmp secret.txt recovered.txt</w:t>
@@ -871,6 +958,7 @@
     <w:p>
       <w:pPr>
         <w:pStyle w:val="CodeBlock"/>
+        <w:shd w:fill="F4F6F9"/>
       </w:pPr>
       <w:r>
         <w:t>echo $?</w:t>
@@ -889,6 +977,7 @@
     <w:p>
       <w:pPr>
         <w:pStyle w:val="CodeBlock"/>
+        <w:shd w:fill="F4F6F9"/>
       </w:pPr>
       <w:r>
         <w:t>python3 decode.py no_secret.png recovered_empty.txt</w:t>
@@ -902,6 +991,7 @@
     <w:p>
       <w:pPr>
         <w:pStyle w:val="CodeBlock"/>
+        <w:shd w:fill="F4F6F9"/>
       </w:pPr>
       <w:r>
         <w:t>NO_SECRET_HEADER</w:t>
@@ -944,6 +1034,7 @@
     <w:p>
       <w:pPr>
         <w:pStyle w:val="CodeBlock"/>
+        <w:shd w:fill="F4F6F9"/>
       </w:pPr>
       <w:r>
         <w:t>nano analysis.txt</w:t>
@@ -957,6 +1048,7 @@
     <w:p>
       <w:pPr>
         <w:pStyle w:val="CodeBlock"/>
+        <w:shd w:fill="F4F6F9"/>
       </w:pPr>
       <w:r>
         <w:t>capacity_bits=196608</w:t>
@@ -965,6 +1057,7 @@
     <w:p>
       <w:pPr>
         <w:pStyle w:val="CodeBlock"/>
+        <w:shd w:fill="F4F6F9"/>
       </w:pPr>
       <w:r>
         <w:t>capacity_bytes=24576</w:t>
@@ -973,6 +1066,7 @@
     <w:p>
       <w:pPr>
         <w:pStyle w:val="CodeBlock"/>
+        <w:shd w:fill="F4F6F9"/>
       </w:pPr>
       <w:r>
         <w:t>header_bytes=44</w:t>
@@ -981,6 +1075,7 @@
     <w:p>
       <w:pPr>
         <w:pStyle w:val="CodeBlock"/>
+        <w:shd w:fill="F4F6F9"/>
       </w:pPr>
       <w:r>
         <w:t>max_payload_bytes=24532</w:t>
@@ -1023,6 +1118,7 @@
     <w:p>
       <w:pPr>
         <w:pStyle w:val="CodeBlock"/>
+        <w:shd w:fill="F4F6F9"/>
       </w:pPr>
       <w:r>
         <w:t>cat analysis.txt</w:t>
@@ -1097,6 +1193,7 @@
     <w:p>
       <w:pPr>
         <w:pStyle w:val="CodeBlock"/>
+        <w:shd w:fill="F4F6F9"/>
       </w:pPr>
       <w:r>
         <w:t>bash check_work.sh</w:t>
@@ -1110,6 +1207,7 @@
     <w:p>
       <w:pPr>
         <w:pStyle w:val="CodeBlock"/>
+        <w:shd w:fill="F4F6F9"/>
       </w:pPr>
       <w:r>
         <w:t>TASK1_ENCODE_IMAGE_PASS</w:t>
@@ -1118,6 +1216,7 @@
     <w:p>
       <w:pPr>
         <w:pStyle w:val="CodeBlock"/>
+        <w:shd w:fill="F4F6F9"/>
       </w:pPr>
       <w:r>
         <w:t>TASK2_HEADER_DETECTED_PASS</w:t>
@@ -1126,6 +1225,7 @@
     <w:p>
       <w:pPr>
         <w:pStyle w:val="CodeBlock"/>
+        <w:shd w:fill="F4F6F9"/>
       </w:pPr>
       <w:r>
         <w:t>TASK3_HASH_VALID_PASS</w:t>
@@ -1134,6 +1234,7 @@
     <w:p>
       <w:pPr>
         <w:pStyle w:val="CodeBlock"/>
+        <w:shd w:fill="F4F6F9"/>
       </w:pPr>
       <w:r>
         <w:t>TASK4_RECOVERED_MATCH_PASS</w:t>
@@ -1142,6 +1243,7 @@
     <w:p>
       <w:pPr>
         <w:pStyle w:val="CodeBlock"/>
+        <w:shd w:fill="F4F6F9"/>
       </w:pPr>
       <w:r>
         <w:t>TASK5_NEGATIVE_TEST_PASS</w:t>
@@ -1150,6 +1252,7 @@
     <w:p>
       <w:pPr>
         <w:pStyle w:val="CodeBlock"/>
+        <w:shd w:fill="F4F6F9"/>
       </w:pPr>
       <w:r>
         <w:t>TASK6_CAPACITY_ANALYSIS_PASS</w:t>
@@ -1158,6 +1261,7 @@
     <w:p>
       <w:pPr>
         <w:pStyle w:val="CodeBlock"/>
+        <w:shd w:fill="F4F6F9"/>
       </w:pPr>
       <w:r>
         <w:t>ALL_TASKS_PASS</w:t>
@@ -1171,6 +1275,7 @@
     <w:p>
       <w:pPr>
         <w:pStyle w:val="CodeBlock"/>
+        <w:shd w:fill="F4F6F9"/>
       </w:pPr>
       <w:r>
         <w:t>cat encode.log</w:t>
@@ -1179,6 +1284,7 @@
     <w:p>
       <w:pPr>
         <w:pStyle w:val="CodeBlock"/>
+        <w:shd w:fill="F4F6F9"/>
       </w:pPr>
       <w:r>
         <w:t>cat decode.log</w:t>
@@ -1187,6 +1293,7 @@
     <w:p>
       <w:pPr>
         <w:pStyle w:val="CodeBlock"/>
+        <w:shd w:fill="F4F6F9"/>
       </w:pPr>
       <w:r>
         <w:t>cat no_header.log</w:t>
@@ -1200,6 +1307,7 @@
     <w:p>
       <w:pPr>
         <w:pStyle w:val="CodeBlock"/>
+        <w:shd w:fill="F4F6F9"/>
       </w:pPr>
       <w:r>
         <w:t>checkwork lsb-secret-header</w:t>
@@ -1213,6 +1321,7 @@
     <w:p>
       <w:pPr>
         <w:pStyle w:val="CodeBlock"/>
+        <w:shd w:fill="F4F6F9"/>
       </w:pPr>
       <w:r>
         <w:t>Y - Task_1_Encode_image</w:t>
@@ -1221,6 +1330,7 @@
     <w:p>
       <w:pPr>
         <w:pStyle w:val="CodeBlock"/>
+        <w:shd w:fill="F4F6F9"/>
       </w:pPr>
       <w:r>
         <w:t>Y - Task_2_Detect_secret_header</w:t>
@@ -1229,6 +1339,7 @@
     <w:p>
       <w:pPr>
         <w:pStyle w:val="CodeBlock"/>
+        <w:shd w:fill="F4F6F9"/>
       </w:pPr>
       <w:r>
         <w:t>Y - Task_3_Verify_SHA256</w:t>
@@ -1237,6 +1348,7 @@
     <w:p>
       <w:pPr>
         <w:pStyle w:val="CodeBlock"/>
+        <w:shd w:fill="F4F6F9"/>
       </w:pPr>
       <w:r>
         <w:t>Y - Task_4_Recover_original_message</w:t>
@@ -1245,6 +1357,7 @@
     <w:p>
       <w:pPr>
         <w:pStyle w:val="CodeBlock"/>
+        <w:shd w:fill="F4F6F9"/>
       </w:pPr>
       <w:r>
         <w:t>Y - Task_5_Detect_image_without_secret</w:t>
@@ -1253,6 +1366,7 @@
     <w:p>
       <w:pPr>
         <w:pStyle w:val="CodeBlock"/>
+        <w:shd w:fill="F4F6F9"/>
       </w:pPr>
       <w:r>
         <w:t>Y - Task_6_Calculate_capacity</w:t>
@@ -1261,6 +1375,7 @@
     <w:p>
       <w:pPr>
         <w:pStyle w:val="CodeBlock"/>
+        <w:shd w:fill="F4F6F9"/>
       </w:pPr>
       <w:r>
         <w:t>Y - All_tasks_completed</w:t>
@@ -1274,6 +1389,7 @@
     <w:p>
       <w:pPr>
         <w:pStyle w:val="CodeBlock"/>
+        <w:shd w:fill="F4F6F9"/>
       </w:pPr>
       <w:r>
         <w:t>stoplab lsb-secret-header</w:t>
@@ -1287,6 +1403,7 @@
     <w:p>
       <w:pPr>
         <w:pStyle w:val="CodeBlock"/>
+        <w:shd w:fill="F4F6F9"/>
       </w:pPr>
       <w:r>
         <w:t>~/labtainer_xfer/lsb-secret-header</w:t>
@@ -1300,6 +1417,7 @@
     <w:p>
       <w:pPr>
         <w:pStyle w:val="CodeBlock"/>
+        <w:shd w:fill="F4F6F9"/>
       </w:pPr>
       <w:r>
         <w:t>&lt;student_id&gt;.lsb-secret-header.lab</w:t>

</xml_diff>

<commit_message>
Simplify guide title header
</commit_message>
<xml_diff>
--- a/docs/lsb-secret-header-word-guide.docx
+++ b/docs/lsb-secret-header-word-guide.docx
@@ -7,28 +7,7 @@
         <w:pStyle w:val="Title"/>
       </w:pPr>
       <w:r>
-        <w:t>Hướng Dẫn Từng Bước</w:t>
-      </w:r>
-    </w:p>
-    <w:p>
-      <w:pPr>
-        <w:jc w:val="left"/>
-      </w:pPr>
-      <w:r>
-        <w:rPr>
-          <w:b/>
-        </w:rPr>
-        <w:t>Lab: Giấu tin bằng LSB + header bí mật | lsb-secret-header</w:t>
-      </w:r>
-    </w:p>
-    <w:p>
-      <w:r>
-        <w:t>HƯỚNG DẪN TỪNG BƯỚC: GIẤU TIN BẰNG LSB + HEADER BÍ MẬT</w:t>
-      </w:r>
-    </w:p>
-    <w:p>
-      <w:r>
-        <w:t>Tên bài: lsb-secret-header</w:t>
+        <w:t>lsb-secret-header</w:t>
       </w:r>
     </w:p>
     <w:p>

</xml_diff>